<commit_message>
answer 5 to ArrayList Task Scheduler
</commit_message>
<xml_diff>
--- a/IT245 - Project.docx
+++ b/IT245 - Project.docx
@@ -6407,13 +6407,11 @@
         <w:spacing w:before="0" w:line="276" w:lineRule="auto"/>
         <w:rPr>
           <w:color w:val="0070C0"/>
-          <w:lang/>
-        </w:rPr>
-      </w:pPr>
-      <w:r>
-        <w:rPr>
-          <w:color w:val="0070C0"/>
-          <w:lang/>
+        </w:rPr>
+      </w:pPr>
+      <w:r>
+        <w:rPr>
+          <w:color w:val="0070C0"/>
         </w:rPr>
         <w:t>import java.util.ArrayList;</w:t>
       </w:r>
@@ -6424,23 +6422,20 @@
         <w:spacing w:before="0" w:line="276" w:lineRule="auto"/>
         <w:rPr>
           <w:color w:val="0070C0"/>
-          <w:lang/>
-        </w:rPr>
-      </w:pPr>
-    </w:p>
-    <w:p>
-      <w:pPr>
-        <w:pStyle w:val="IT245"/>
-        <w:spacing w:before="0" w:line="276" w:lineRule="auto"/>
-        <w:rPr>
-          <w:color w:val="0070C0"/>
-          <w:lang/>
-        </w:rPr>
-      </w:pPr>
-      <w:r>
-        <w:rPr>
-          <w:color w:val="0070C0"/>
-          <w:lang/>
+        </w:rPr>
+      </w:pPr>
+    </w:p>
+    <w:p>
+      <w:pPr>
+        <w:pStyle w:val="IT245"/>
+        <w:spacing w:before="0" w:line="276" w:lineRule="auto"/>
+        <w:rPr>
+          <w:color w:val="0070C0"/>
+        </w:rPr>
+      </w:pPr>
+      <w:r>
+        <w:rPr>
+          <w:color w:val="0070C0"/>
         </w:rPr>
         <w:t>class ArrayListTaskScheduler {</w:t>
       </w:r>
@@ -6451,13 +6446,11 @@
         <w:spacing w:before="0" w:line="276" w:lineRule="auto"/>
         <w:rPr>
           <w:color w:val="0070C0"/>
-          <w:lang/>
-        </w:rPr>
-      </w:pPr>
-      <w:r>
-        <w:rPr>
-          <w:color w:val="0070C0"/>
-          <w:lang/>
+        </w:rPr>
+      </w:pPr>
+      <w:r>
+        <w:rPr>
+          <w:color w:val="0070C0"/>
         </w:rPr>
         <w:t xml:space="preserve">    private ArrayList&lt;Task&gt; tasks = new ArrayList&lt;&gt;();</w:t>
       </w:r>
@@ -6468,13 +6461,11 @@
         <w:spacing w:before="0" w:line="276" w:lineRule="auto"/>
         <w:rPr>
           <w:color w:val="0070C0"/>
-          <w:lang/>
-        </w:rPr>
-      </w:pPr>
-      <w:r>
-        <w:rPr>
-          <w:color w:val="0070C0"/>
-          <w:lang/>
+        </w:rPr>
+      </w:pPr>
+      <w:r>
+        <w:rPr>
+          <w:color w:val="0070C0"/>
         </w:rPr>
         <w:t xml:space="preserve">    private long sequence = 0;</w:t>
       </w:r>
@@ -6485,23 +6476,20 @@
         <w:spacing w:before="0" w:line="276" w:lineRule="auto"/>
         <w:rPr>
           <w:color w:val="0070C0"/>
-          <w:lang/>
-        </w:rPr>
-      </w:pPr>
-    </w:p>
-    <w:p>
-      <w:pPr>
-        <w:pStyle w:val="IT245"/>
-        <w:spacing w:before="0" w:line="276" w:lineRule="auto"/>
-        <w:rPr>
-          <w:color w:val="0070C0"/>
-          <w:lang/>
-        </w:rPr>
-      </w:pPr>
-      <w:r>
-        <w:rPr>
-          <w:color w:val="0070C0"/>
-          <w:lang/>
+        </w:rPr>
+      </w:pPr>
+    </w:p>
+    <w:p>
+      <w:pPr>
+        <w:pStyle w:val="IT245"/>
+        <w:spacing w:before="0" w:line="276" w:lineRule="auto"/>
+        <w:rPr>
+          <w:color w:val="0070C0"/>
+        </w:rPr>
+      </w:pPr>
+      <w:r>
+        <w:rPr>
+          <w:color w:val="0070C0"/>
         </w:rPr>
         <w:t xml:space="preserve">    public void addTask(int id, String name, int priority) {</w:t>
       </w:r>
@@ -6512,13 +6500,11 @@
         <w:spacing w:before="0" w:line="276" w:lineRule="auto"/>
         <w:rPr>
           <w:color w:val="0070C0"/>
-          <w:lang/>
-        </w:rPr>
-      </w:pPr>
-      <w:r>
-        <w:rPr>
-          <w:color w:val="0070C0"/>
-          <w:lang/>
+        </w:rPr>
+      </w:pPr>
+      <w:r>
+        <w:rPr>
+          <w:color w:val="0070C0"/>
         </w:rPr>
         <w:t xml:space="preserve">        if (name == null || name.trim().isEmpty()) {</w:t>
       </w:r>
@@ -6529,13 +6515,11 @@
         <w:spacing w:before="0" w:line="276" w:lineRule="auto"/>
         <w:rPr>
           <w:color w:val="0070C0"/>
-          <w:lang/>
-        </w:rPr>
-      </w:pPr>
-      <w:r>
-        <w:rPr>
-          <w:color w:val="0070C0"/>
-          <w:lang/>
+        </w:rPr>
+      </w:pPr>
+      <w:r>
+        <w:rPr>
+          <w:color w:val="0070C0"/>
         </w:rPr>
         <w:t xml:space="preserve">            System.out.println("Task name cannot be empty.");</w:t>
       </w:r>
@@ -6546,13 +6530,11 @@
         <w:spacing w:before="0" w:line="276" w:lineRule="auto"/>
         <w:rPr>
           <w:color w:val="0070C0"/>
-          <w:lang/>
-        </w:rPr>
-      </w:pPr>
-      <w:r>
-        <w:rPr>
-          <w:color w:val="0070C0"/>
-          <w:lang/>
+        </w:rPr>
+      </w:pPr>
+      <w:r>
+        <w:rPr>
+          <w:color w:val="0070C0"/>
         </w:rPr>
         <w:t xml:space="preserve">            return;</w:t>
       </w:r>
@@ -6563,13 +6545,11 @@
         <w:spacing w:before="0" w:line="276" w:lineRule="auto"/>
         <w:rPr>
           <w:color w:val="0070C0"/>
-          <w:lang/>
-        </w:rPr>
-      </w:pPr>
-      <w:r>
-        <w:rPr>
-          <w:color w:val="0070C0"/>
-          <w:lang/>
+        </w:rPr>
+      </w:pPr>
+      <w:r>
+        <w:rPr>
+          <w:color w:val="0070C0"/>
         </w:rPr>
         <w:t xml:space="preserve">        }</w:t>
       </w:r>
@@ -6580,23 +6560,20 @@
         <w:spacing w:before="0" w:line="276" w:lineRule="auto"/>
         <w:rPr>
           <w:color w:val="0070C0"/>
-          <w:lang/>
-        </w:rPr>
-      </w:pPr>
-    </w:p>
-    <w:p>
-      <w:pPr>
-        <w:pStyle w:val="IT245"/>
-        <w:spacing w:before="0" w:line="276" w:lineRule="auto"/>
-        <w:rPr>
-          <w:color w:val="0070C0"/>
-          <w:lang/>
-        </w:rPr>
-      </w:pPr>
-      <w:r>
-        <w:rPr>
-          <w:color w:val="0070C0"/>
-          <w:lang/>
+        </w:rPr>
+      </w:pPr>
+    </w:p>
+    <w:p>
+      <w:pPr>
+        <w:pStyle w:val="IT245"/>
+        <w:spacing w:before="0" w:line="276" w:lineRule="auto"/>
+        <w:rPr>
+          <w:color w:val="0070C0"/>
+        </w:rPr>
+      </w:pPr>
+      <w:r>
+        <w:rPr>
+          <w:color w:val="0070C0"/>
         </w:rPr>
         <w:t xml:space="preserve">        if (priority &lt; 1) {</w:t>
       </w:r>
@@ -6607,13 +6584,11 @@
         <w:spacing w:before="0" w:line="276" w:lineRule="auto"/>
         <w:rPr>
           <w:color w:val="0070C0"/>
-          <w:lang/>
-        </w:rPr>
-      </w:pPr>
-      <w:r>
-        <w:rPr>
-          <w:color w:val="0070C0"/>
-          <w:lang/>
+        </w:rPr>
+      </w:pPr>
+      <w:r>
+        <w:rPr>
+          <w:color w:val="0070C0"/>
         </w:rPr>
         <w:t xml:space="preserve">            System.out.println("Priority must be 1 or greater.");</w:t>
       </w:r>
@@ -6624,13 +6599,11 @@
         <w:spacing w:before="0" w:line="276" w:lineRule="auto"/>
         <w:rPr>
           <w:color w:val="0070C0"/>
-          <w:lang/>
-        </w:rPr>
-      </w:pPr>
-      <w:r>
-        <w:rPr>
-          <w:color w:val="0070C0"/>
-          <w:lang/>
+        </w:rPr>
+      </w:pPr>
+      <w:r>
+        <w:rPr>
+          <w:color w:val="0070C0"/>
         </w:rPr>
         <w:t xml:space="preserve">            return;</w:t>
       </w:r>
@@ -6641,13 +6614,11 @@
         <w:spacing w:before="0" w:line="276" w:lineRule="auto"/>
         <w:rPr>
           <w:color w:val="0070C0"/>
-          <w:lang/>
-        </w:rPr>
-      </w:pPr>
-      <w:r>
-        <w:rPr>
-          <w:color w:val="0070C0"/>
-          <w:lang/>
+        </w:rPr>
+      </w:pPr>
+      <w:r>
+        <w:rPr>
+          <w:color w:val="0070C0"/>
         </w:rPr>
         <w:lastRenderedPageBreak/>
         <w:t xml:space="preserve">        }</w:t>
@@ -6659,23 +6630,20 @@
         <w:spacing w:before="0" w:line="276" w:lineRule="auto"/>
         <w:rPr>
           <w:color w:val="0070C0"/>
-          <w:lang/>
-        </w:rPr>
-      </w:pPr>
-    </w:p>
-    <w:p>
-      <w:pPr>
-        <w:pStyle w:val="IT245"/>
-        <w:spacing w:before="0" w:line="276" w:lineRule="auto"/>
-        <w:rPr>
-          <w:color w:val="0070C0"/>
-          <w:lang/>
-        </w:rPr>
-      </w:pPr>
-      <w:r>
-        <w:rPr>
-          <w:color w:val="0070C0"/>
-          <w:lang/>
+        </w:rPr>
+      </w:pPr>
+    </w:p>
+    <w:p>
+      <w:pPr>
+        <w:pStyle w:val="IT245"/>
+        <w:spacing w:before="0" w:line="276" w:lineRule="auto"/>
+        <w:rPr>
+          <w:color w:val="0070C0"/>
+        </w:rPr>
+      </w:pPr>
+      <w:r>
+        <w:rPr>
+          <w:color w:val="0070C0"/>
         </w:rPr>
         <w:t xml:space="preserve">        Task newTask = new Task(id, name, priority, sequence++);</w:t>
       </w:r>
@@ -6686,13 +6654,11 @@
         <w:spacing w:before="0" w:line="276" w:lineRule="auto"/>
         <w:rPr>
           <w:color w:val="0070C0"/>
-          <w:lang/>
-        </w:rPr>
-      </w:pPr>
-      <w:r>
-        <w:rPr>
-          <w:color w:val="0070C0"/>
-          <w:lang/>
+        </w:rPr>
+      </w:pPr>
+      <w:r>
+        <w:rPr>
+          <w:color w:val="0070C0"/>
         </w:rPr>
         <w:t xml:space="preserve">        int position = 0;</w:t>
       </w:r>
@@ -6703,23 +6669,20 @@
         <w:spacing w:before="0" w:line="276" w:lineRule="auto"/>
         <w:rPr>
           <w:color w:val="0070C0"/>
-          <w:lang/>
-        </w:rPr>
-      </w:pPr>
-    </w:p>
-    <w:p>
-      <w:pPr>
-        <w:pStyle w:val="IT245"/>
-        <w:spacing w:before="0" w:line="276" w:lineRule="auto"/>
-        <w:rPr>
-          <w:color w:val="0070C0"/>
-          <w:lang/>
-        </w:rPr>
-      </w:pPr>
-      <w:r>
-        <w:rPr>
-          <w:color w:val="0070C0"/>
-          <w:lang/>
+        </w:rPr>
+      </w:pPr>
+    </w:p>
+    <w:p>
+      <w:pPr>
+        <w:pStyle w:val="IT245"/>
+        <w:spacing w:before="0" w:line="276" w:lineRule="auto"/>
+        <w:rPr>
+          <w:color w:val="0070C0"/>
+        </w:rPr>
+      </w:pPr>
+      <w:r>
+        <w:rPr>
+          <w:color w:val="0070C0"/>
         </w:rPr>
         <w:t xml:space="preserve">        while (position &lt; tasks.size()) {</w:t>
       </w:r>
@@ -6730,13 +6693,11 @@
         <w:spacing w:before="0" w:line="276" w:lineRule="auto"/>
         <w:rPr>
           <w:color w:val="0070C0"/>
-          <w:lang/>
-        </w:rPr>
-      </w:pPr>
-      <w:r>
-        <w:rPr>
-          <w:color w:val="0070C0"/>
-          <w:lang/>
+        </w:rPr>
+      </w:pPr>
+      <w:r>
+        <w:rPr>
+          <w:color w:val="0070C0"/>
         </w:rPr>
         <w:t xml:space="preserve">            Task current = tasks.get(position);</w:t>
       </w:r>
@@ -6747,23 +6708,20 @@
         <w:spacing w:before="0" w:line="276" w:lineRule="auto"/>
         <w:rPr>
           <w:color w:val="0070C0"/>
-          <w:lang/>
-        </w:rPr>
-      </w:pPr>
-    </w:p>
-    <w:p>
-      <w:pPr>
-        <w:pStyle w:val="IT245"/>
-        <w:spacing w:before="0" w:line="276" w:lineRule="auto"/>
-        <w:rPr>
-          <w:color w:val="0070C0"/>
-          <w:lang/>
-        </w:rPr>
-      </w:pPr>
-      <w:r>
-        <w:rPr>
-          <w:color w:val="0070C0"/>
-          <w:lang/>
+        </w:rPr>
+      </w:pPr>
+    </w:p>
+    <w:p>
+      <w:pPr>
+        <w:pStyle w:val="IT245"/>
+        <w:spacing w:before="0" w:line="276" w:lineRule="auto"/>
+        <w:rPr>
+          <w:color w:val="0070C0"/>
+        </w:rPr>
+      </w:pPr>
+      <w:r>
+        <w:rPr>
+          <w:color w:val="0070C0"/>
         </w:rPr>
         <w:t xml:space="preserve">            boolean currentHasHigherPriority =</w:t>
       </w:r>
@@ -6774,13 +6732,11 @@
         <w:spacing w:before="0" w:line="276" w:lineRule="auto"/>
         <w:rPr>
           <w:color w:val="0070C0"/>
-          <w:lang/>
-        </w:rPr>
-      </w:pPr>
-      <w:r>
-        <w:rPr>
-          <w:color w:val="0070C0"/>
-          <w:lang/>
+        </w:rPr>
+      </w:pPr>
+      <w:r>
+        <w:rPr>
+          <w:color w:val="0070C0"/>
         </w:rPr>
         <w:t xml:space="preserve">                    current.getPriority() &lt; newTask.getPriority();</w:t>
       </w:r>
@@ -6791,23 +6747,20 @@
         <w:spacing w:before="0" w:line="276" w:lineRule="auto"/>
         <w:rPr>
           <w:color w:val="0070C0"/>
-          <w:lang/>
-        </w:rPr>
-      </w:pPr>
-    </w:p>
-    <w:p>
-      <w:pPr>
-        <w:pStyle w:val="IT245"/>
-        <w:spacing w:before="0" w:line="276" w:lineRule="auto"/>
-        <w:rPr>
-          <w:color w:val="0070C0"/>
-          <w:lang/>
-        </w:rPr>
-      </w:pPr>
-      <w:r>
-        <w:rPr>
-          <w:color w:val="0070C0"/>
-          <w:lang/>
+        </w:rPr>
+      </w:pPr>
+    </w:p>
+    <w:p>
+      <w:pPr>
+        <w:pStyle w:val="IT245"/>
+        <w:spacing w:before="0" w:line="276" w:lineRule="auto"/>
+        <w:rPr>
+          <w:color w:val="0070C0"/>
+        </w:rPr>
+      </w:pPr>
+      <w:r>
+        <w:rPr>
+          <w:color w:val="0070C0"/>
         </w:rPr>
         <w:t xml:space="preserve">            boolean samePriorityAndEarlier =</w:t>
       </w:r>
@@ -6818,13 +6771,11 @@
         <w:spacing w:before="0" w:line="276" w:lineRule="auto"/>
         <w:rPr>
           <w:color w:val="0070C0"/>
-          <w:lang/>
-        </w:rPr>
-      </w:pPr>
-      <w:r>
-        <w:rPr>
-          <w:color w:val="0070C0"/>
-          <w:lang/>
+        </w:rPr>
+      </w:pPr>
+      <w:r>
+        <w:rPr>
+          <w:color w:val="0070C0"/>
         </w:rPr>
         <w:t xml:space="preserve">                    current.getPriority() == newTask.getPriority()</w:t>
       </w:r>
@@ -6835,13 +6786,11 @@
         <w:spacing w:before="0" w:line="276" w:lineRule="auto"/>
         <w:rPr>
           <w:color w:val="0070C0"/>
-          <w:lang/>
-        </w:rPr>
-      </w:pPr>
-      <w:r>
-        <w:rPr>
-          <w:color w:val="0070C0"/>
-          <w:lang/>
+        </w:rPr>
+      </w:pPr>
+      <w:r>
+        <w:rPr>
+          <w:color w:val="0070C0"/>
         </w:rPr>
         <w:t xml:space="preserve">                    &amp;&amp; current.getArrivalOrder() &lt; newTask.getArrivalOrder();</w:t>
       </w:r>
@@ -6852,23 +6801,20 @@
         <w:spacing w:before="0" w:line="276" w:lineRule="auto"/>
         <w:rPr>
           <w:color w:val="0070C0"/>
-          <w:lang/>
-        </w:rPr>
-      </w:pPr>
-    </w:p>
-    <w:p>
-      <w:pPr>
-        <w:pStyle w:val="IT245"/>
-        <w:spacing w:before="0" w:line="276" w:lineRule="auto"/>
-        <w:rPr>
-          <w:color w:val="0070C0"/>
-          <w:lang/>
-        </w:rPr>
-      </w:pPr>
-      <w:r>
-        <w:rPr>
-          <w:color w:val="0070C0"/>
-          <w:lang/>
+        </w:rPr>
+      </w:pPr>
+    </w:p>
+    <w:p>
+      <w:pPr>
+        <w:pStyle w:val="IT245"/>
+        <w:spacing w:before="0" w:line="276" w:lineRule="auto"/>
+        <w:rPr>
+          <w:color w:val="0070C0"/>
+        </w:rPr>
+      </w:pPr>
+      <w:r>
+        <w:rPr>
+          <w:color w:val="0070C0"/>
         </w:rPr>
         <w:t xml:space="preserve">            if (currentHasHigherPriority || samePriorityAndEarlier) {</w:t>
       </w:r>
@@ -6879,13 +6825,11 @@
         <w:spacing w:before="0" w:line="276" w:lineRule="auto"/>
         <w:rPr>
           <w:color w:val="0070C0"/>
-          <w:lang/>
-        </w:rPr>
-      </w:pPr>
-      <w:r>
-        <w:rPr>
-          <w:color w:val="0070C0"/>
-          <w:lang/>
+        </w:rPr>
+      </w:pPr>
+      <w:r>
+        <w:rPr>
+          <w:color w:val="0070C0"/>
         </w:rPr>
         <w:t xml:space="preserve">                position++;</w:t>
       </w:r>
@@ -6896,13 +6840,11 @@
         <w:spacing w:before="0" w:line="276" w:lineRule="auto"/>
         <w:rPr>
           <w:color w:val="0070C0"/>
-          <w:lang/>
-        </w:rPr>
-      </w:pPr>
-      <w:r>
-        <w:rPr>
-          <w:color w:val="0070C0"/>
-          <w:lang/>
+        </w:rPr>
+      </w:pPr>
+      <w:r>
+        <w:rPr>
+          <w:color w:val="0070C0"/>
         </w:rPr>
         <w:t xml:space="preserve">            } else {</w:t>
       </w:r>
@@ -6913,13 +6855,11 @@
         <w:spacing w:before="0" w:line="276" w:lineRule="auto"/>
         <w:rPr>
           <w:color w:val="0070C0"/>
-          <w:lang/>
-        </w:rPr>
-      </w:pPr>
-      <w:r>
-        <w:rPr>
-          <w:color w:val="0070C0"/>
-          <w:lang/>
+        </w:rPr>
+      </w:pPr>
+      <w:r>
+        <w:rPr>
+          <w:color w:val="0070C0"/>
         </w:rPr>
         <w:t xml:space="preserve">                break;</w:t>
       </w:r>
@@ -6930,13 +6870,11 @@
         <w:spacing w:before="0" w:line="276" w:lineRule="auto"/>
         <w:rPr>
           <w:color w:val="0070C0"/>
-          <w:lang/>
-        </w:rPr>
-      </w:pPr>
-      <w:r>
-        <w:rPr>
-          <w:color w:val="0070C0"/>
-          <w:lang/>
+        </w:rPr>
+      </w:pPr>
+      <w:r>
+        <w:rPr>
+          <w:color w:val="0070C0"/>
         </w:rPr>
         <w:t xml:space="preserve">            }</w:t>
       </w:r>
@@ -6947,13 +6885,11 @@
         <w:spacing w:before="0" w:line="276" w:lineRule="auto"/>
         <w:rPr>
           <w:color w:val="0070C0"/>
-          <w:lang/>
-        </w:rPr>
-      </w:pPr>
-      <w:r>
-        <w:rPr>
-          <w:color w:val="0070C0"/>
-          <w:lang/>
+        </w:rPr>
+      </w:pPr>
+      <w:r>
+        <w:rPr>
+          <w:color w:val="0070C0"/>
         </w:rPr>
         <w:t xml:space="preserve">        }</w:t>
       </w:r>
@@ -6964,23 +6900,20 @@
         <w:spacing w:before="0" w:line="276" w:lineRule="auto"/>
         <w:rPr>
           <w:color w:val="0070C0"/>
-          <w:lang/>
-        </w:rPr>
-      </w:pPr>
-    </w:p>
-    <w:p>
-      <w:pPr>
-        <w:pStyle w:val="IT245"/>
-        <w:spacing w:before="0" w:line="276" w:lineRule="auto"/>
-        <w:rPr>
-          <w:color w:val="0070C0"/>
-          <w:lang/>
-        </w:rPr>
-      </w:pPr>
-      <w:r>
-        <w:rPr>
-          <w:color w:val="0070C0"/>
-          <w:lang/>
+        </w:rPr>
+      </w:pPr>
+    </w:p>
+    <w:p>
+      <w:pPr>
+        <w:pStyle w:val="IT245"/>
+        <w:spacing w:before="0" w:line="276" w:lineRule="auto"/>
+        <w:rPr>
+          <w:color w:val="0070C0"/>
+        </w:rPr>
+      </w:pPr>
+      <w:r>
+        <w:rPr>
+          <w:color w:val="0070C0"/>
         </w:rPr>
         <w:t xml:space="preserve">        tasks.add(position, newTask);</w:t>
       </w:r>
@@ -6991,13 +6924,11 @@
         <w:spacing w:before="0" w:line="276" w:lineRule="auto"/>
         <w:rPr>
           <w:color w:val="0070C0"/>
-          <w:lang/>
-        </w:rPr>
-      </w:pPr>
-      <w:r>
-        <w:rPr>
-          <w:color w:val="0070C0"/>
-          <w:lang/>
+        </w:rPr>
+      </w:pPr>
+      <w:r>
+        <w:rPr>
+          <w:color w:val="0070C0"/>
         </w:rPr>
         <w:t xml:space="preserve">    }</w:t>
       </w:r>
@@ -7008,23 +6939,20 @@
         <w:spacing w:before="0" w:line="276" w:lineRule="auto"/>
         <w:rPr>
           <w:color w:val="0070C0"/>
-          <w:lang/>
-        </w:rPr>
-      </w:pPr>
-    </w:p>
-    <w:p>
-      <w:pPr>
-        <w:pStyle w:val="IT245"/>
-        <w:spacing w:before="0" w:line="276" w:lineRule="auto"/>
-        <w:rPr>
-          <w:color w:val="0070C0"/>
-          <w:lang/>
-        </w:rPr>
-      </w:pPr>
-      <w:r>
-        <w:rPr>
-          <w:color w:val="0070C0"/>
-          <w:lang/>
+        </w:rPr>
+      </w:pPr>
+    </w:p>
+    <w:p>
+      <w:pPr>
+        <w:pStyle w:val="IT245"/>
+        <w:spacing w:before="0" w:line="276" w:lineRule="auto"/>
+        <w:rPr>
+          <w:color w:val="0070C0"/>
+        </w:rPr>
+      </w:pPr>
+      <w:r>
+        <w:rPr>
+          <w:color w:val="0070C0"/>
         </w:rPr>
         <w:t xml:space="preserve">    public Task viewNextTask() {</w:t>
       </w:r>
@@ -7035,13 +6963,11 @@
         <w:spacing w:before="0" w:line="276" w:lineRule="auto"/>
         <w:rPr>
           <w:color w:val="0070C0"/>
-          <w:lang/>
-        </w:rPr>
-      </w:pPr>
-      <w:r>
-        <w:rPr>
-          <w:color w:val="0070C0"/>
-          <w:lang/>
+        </w:rPr>
+      </w:pPr>
+      <w:r>
+        <w:rPr>
+          <w:color w:val="0070C0"/>
         </w:rPr>
         <w:t xml:space="preserve">        if (tasks.isEmpty()) {</w:t>
       </w:r>
@@ -7052,13 +6978,11 @@
         <w:spacing w:before="0" w:line="276" w:lineRule="auto"/>
         <w:rPr>
           <w:color w:val="0070C0"/>
-          <w:lang/>
-        </w:rPr>
-      </w:pPr>
-      <w:r>
-        <w:rPr>
-          <w:color w:val="0070C0"/>
-          <w:lang/>
+        </w:rPr>
+      </w:pPr>
+      <w:r>
+        <w:rPr>
+          <w:color w:val="0070C0"/>
         </w:rPr>
         <w:t xml:space="preserve">            return null;</w:t>
       </w:r>
@@ -7069,13 +6993,11 @@
         <w:spacing w:before="0" w:line="276" w:lineRule="auto"/>
         <w:rPr>
           <w:color w:val="0070C0"/>
-          <w:lang/>
-        </w:rPr>
-      </w:pPr>
-      <w:r>
-        <w:rPr>
-          <w:color w:val="0070C0"/>
-          <w:lang/>
+        </w:rPr>
+      </w:pPr>
+      <w:r>
+        <w:rPr>
+          <w:color w:val="0070C0"/>
         </w:rPr>
         <w:t xml:space="preserve">        }</w:t>
       </w:r>
@@ -7086,23 +7008,20 @@
         <w:spacing w:before="0" w:line="276" w:lineRule="auto"/>
         <w:rPr>
           <w:color w:val="0070C0"/>
-          <w:lang/>
-        </w:rPr>
-      </w:pPr>
-    </w:p>
-    <w:p>
-      <w:pPr>
-        <w:pStyle w:val="IT245"/>
-        <w:spacing w:before="0" w:line="276" w:lineRule="auto"/>
-        <w:rPr>
-          <w:color w:val="0070C0"/>
-          <w:lang/>
-        </w:rPr>
-      </w:pPr>
-      <w:r>
-        <w:rPr>
-          <w:color w:val="0070C0"/>
-          <w:lang/>
+        </w:rPr>
+      </w:pPr>
+    </w:p>
+    <w:p>
+      <w:pPr>
+        <w:pStyle w:val="IT245"/>
+        <w:spacing w:before="0" w:line="276" w:lineRule="auto"/>
+        <w:rPr>
+          <w:color w:val="0070C0"/>
+        </w:rPr>
+      </w:pPr>
+      <w:r>
+        <w:rPr>
+          <w:color w:val="0070C0"/>
         </w:rPr>
         <w:t xml:space="preserve">        return tasks.get(0);</w:t>
       </w:r>
@@ -7113,13 +7032,11 @@
         <w:spacing w:before="0" w:line="276" w:lineRule="auto"/>
         <w:rPr>
           <w:color w:val="0070C0"/>
-          <w:lang/>
-        </w:rPr>
-      </w:pPr>
-      <w:r>
-        <w:rPr>
-          <w:color w:val="0070C0"/>
-          <w:lang/>
+        </w:rPr>
+      </w:pPr>
+      <w:r>
+        <w:rPr>
+          <w:color w:val="0070C0"/>
         </w:rPr>
         <w:t xml:space="preserve">    }</w:t>
       </w:r>
@@ -7130,23 +7047,20 @@
         <w:spacing w:before="0" w:line="276" w:lineRule="auto"/>
         <w:rPr>
           <w:color w:val="0070C0"/>
-          <w:lang/>
-        </w:rPr>
-      </w:pPr>
-    </w:p>
-    <w:p>
-      <w:pPr>
-        <w:pStyle w:val="IT245"/>
-        <w:spacing w:before="0" w:line="276" w:lineRule="auto"/>
-        <w:rPr>
-          <w:color w:val="0070C0"/>
-          <w:lang/>
-        </w:rPr>
-      </w:pPr>
-      <w:r>
-        <w:rPr>
-          <w:color w:val="0070C0"/>
-          <w:lang/>
+        </w:rPr>
+      </w:pPr>
+    </w:p>
+    <w:p>
+      <w:pPr>
+        <w:pStyle w:val="IT245"/>
+        <w:spacing w:before="0" w:line="276" w:lineRule="auto"/>
+        <w:rPr>
+          <w:color w:val="0070C0"/>
+        </w:rPr>
+      </w:pPr>
+      <w:r>
+        <w:rPr>
+          <w:color w:val="0070C0"/>
         </w:rPr>
         <w:t xml:space="preserve">    public Task processNextTask() {</w:t>
       </w:r>
@@ -7157,13 +7071,11 @@
         <w:spacing w:before="0" w:line="276" w:lineRule="auto"/>
         <w:rPr>
           <w:color w:val="0070C0"/>
-          <w:lang/>
-        </w:rPr>
-      </w:pPr>
-      <w:r>
-        <w:rPr>
-          <w:color w:val="0070C0"/>
-          <w:lang/>
+        </w:rPr>
+      </w:pPr>
+      <w:r>
+        <w:rPr>
+          <w:color w:val="0070C0"/>
         </w:rPr>
         <w:t xml:space="preserve">        if (tasks.isEmpty()) {</w:t>
       </w:r>
@@ -7174,13 +7086,11 @@
         <w:spacing w:before="0" w:line="276" w:lineRule="auto"/>
         <w:rPr>
           <w:color w:val="0070C0"/>
-          <w:lang/>
-        </w:rPr>
-      </w:pPr>
-      <w:r>
-        <w:rPr>
-          <w:color w:val="0070C0"/>
-          <w:lang/>
+        </w:rPr>
+      </w:pPr>
+      <w:r>
+        <w:rPr>
+          <w:color w:val="0070C0"/>
         </w:rPr>
         <w:lastRenderedPageBreak/>
         <w:t xml:space="preserve">            return null;</w:t>
@@ -7192,13 +7102,11 @@
         <w:spacing w:before="0" w:line="276" w:lineRule="auto"/>
         <w:rPr>
           <w:color w:val="0070C0"/>
-          <w:lang/>
-        </w:rPr>
-      </w:pPr>
-      <w:r>
-        <w:rPr>
-          <w:color w:val="0070C0"/>
-          <w:lang/>
+        </w:rPr>
+      </w:pPr>
+      <w:r>
+        <w:rPr>
+          <w:color w:val="0070C0"/>
         </w:rPr>
         <w:t xml:space="preserve">        }</w:t>
       </w:r>
@@ -7209,23 +7117,20 @@
         <w:spacing w:before="0" w:line="276" w:lineRule="auto"/>
         <w:rPr>
           <w:color w:val="0070C0"/>
-          <w:lang/>
-        </w:rPr>
-      </w:pPr>
-    </w:p>
-    <w:p>
-      <w:pPr>
-        <w:pStyle w:val="IT245"/>
-        <w:spacing w:before="0" w:line="276" w:lineRule="auto"/>
-        <w:rPr>
-          <w:color w:val="0070C0"/>
-          <w:lang/>
-        </w:rPr>
-      </w:pPr>
-      <w:r>
-        <w:rPr>
-          <w:color w:val="0070C0"/>
-          <w:lang/>
+        </w:rPr>
+      </w:pPr>
+    </w:p>
+    <w:p>
+      <w:pPr>
+        <w:pStyle w:val="IT245"/>
+        <w:spacing w:before="0" w:line="276" w:lineRule="auto"/>
+        <w:rPr>
+          <w:color w:val="0070C0"/>
+        </w:rPr>
+      </w:pPr>
+      <w:r>
+        <w:rPr>
+          <w:color w:val="0070C0"/>
         </w:rPr>
         <w:t xml:space="preserve">        return tasks.remove(0);</w:t>
       </w:r>
@@ -7236,13 +7141,11 @@
         <w:spacing w:before="0" w:line="276" w:lineRule="auto"/>
         <w:rPr>
           <w:color w:val="0070C0"/>
-          <w:lang/>
-        </w:rPr>
-      </w:pPr>
-      <w:r>
-        <w:rPr>
-          <w:color w:val="0070C0"/>
-          <w:lang/>
+        </w:rPr>
+      </w:pPr>
+      <w:r>
+        <w:rPr>
+          <w:color w:val="0070C0"/>
         </w:rPr>
         <w:t xml:space="preserve">    }</w:t>
       </w:r>
@@ -7253,23 +7156,20 @@
         <w:spacing w:before="0" w:line="276" w:lineRule="auto"/>
         <w:rPr>
           <w:color w:val="0070C0"/>
-          <w:lang/>
-        </w:rPr>
-      </w:pPr>
-    </w:p>
-    <w:p>
-      <w:pPr>
-        <w:pStyle w:val="IT245"/>
-        <w:spacing w:before="0" w:line="276" w:lineRule="auto"/>
-        <w:rPr>
-          <w:color w:val="0070C0"/>
-          <w:lang/>
-        </w:rPr>
-      </w:pPr>
-      <w:r>
-        <w:rPr>
-          <w:color w:val="0070C0"/>
-          <w:lang/>
+        </w:rPr>
+      </w:pPr>
+    </w:p>
+    <w:p>
+      <w:pPr>
+        <w:pStyle w:val="IT245"/>
+        <w:spacing w:before="0" w:line="276" w:lineRule="auto"/>
+        <w:rPr>
+          <w:color w:val="0070C0"/>
+        </w:rPr>
+      </w:pPr>
+      <w:r>
+        <w:rPr>
+          <w:color w:val="0070C0"/>
         </w:rPr>
         <w:t xml:space="preserve">    public void displayTasks() {</w:t>
       </w:r>
@@ -7280,13 +7180,11 @@
         <w:spacing w:before="0" w:line="276" w:lineRule="auto"/>
         <w:rPr>
           <w:color w:val="0070C0"/>
-          <w:lang/>
-        </w:rPr>
-      </w:pPr>
-      <w:r>
-        <w:rPr>
-          <w:color w:val="0070C0"/>
-          <w:lang/>
+        </w:rPr>
+      </w:pPr>
+      <w:r>
+        <w:rPr>
+          <w:color w:val="0070C0"/>
         </w:rPr>
         <w:t xml:space="preserve">        if (tasks.isEmpty()) {</w:t>
       </w:r>
@@ -7297,13 +7195,11 @@
         <w:spacing w:before="0" w:line="276" w:lineRule="auto"/>
         <w:rPr>
           <w:color w:val="0070C0"/>
-          <w:lang/>
-        </w:rPr>
-      </w:pPr>
-      <w:r>
-        <w:rPr>
-          <w:color w:val="0070C0"/>
-          <w:lang/>
+        </w:rPr>
+      </w:pPr>
+      <w:r>
+        <w:rPr>
+          <w:color w:val="0070C0"/>
         </w:rPr>
         <w:t xml:space="preserve">            System.out.println("No pending tasks.");</w:t>
       </w:r>
@@ -7314,13 +7210,11 @@
         <w:spacing w:before="0" w:line="276" w:lineRule="auto"/>
         <w:rPr>
           <w:color w:val="0070C0"/>
-          <w:lang/>
-        </w:rPr>
-      </w:pPr>
-      <w:r>
-        <w:rPr>
-          <w:color w:val="0070C0"/>
-          <w:lang/>
+        </w:rPr>
+      </w:pPr>
+      <w:r>
+        <w:rPr>
+          <w:color w:val="0070C0"/>
         </w:rPr>
         <w:t xml:space="preserve">            return;</w:t>
       </w:r>
@@ -7331,13 +7225,11 @@
         <w:spacing w:before="0" w:line="276" w:lineRule="auto"/>
         <w:rPr>
           <w:color w:val="0070C0"/>
-          <w:lang/>
-        </w:rPr>
-      </w:pPr>
-      <w:r>
-        <w:rPr>
-          <w:color w:val="0070C0"/>
-          <w:lang/>
+        </w:rPr>
+      </w:pPr>
+      <w:r>
+        <w:rPr>
+          <w:color w:val="0070C0"/>
         </w:rPr>
         <w:t xml:space="preserve">        }</w:t>
       </w:r>
@@ -7348,23 +7240,20 @@
         <w:spacing w:before="0" w:line="276" w:lineRule="auto"/>
         <w:rPr>
           <w:color w:val="0070C0"/>
-          <w:lang/>
-        </w:rPr>
-      </w:pPr>
-    </w:p>
-    <w:p>
-      <w:pPr>
-        <w:pStyle w:val="IT245"/>
-        <w:spacing w:before="0" w:line="276" w:lineRule="auto"/>
-        <w:rPr>
-          <w:color w:val="0070C0"/>
-          <w:lang/>
-        </w:rPr>
-      </w:pPr>
-      <w:r>
-        <w:rPr>
-          <w:color w:val="0070C0"/>
-          <w:lang/>
+        </w:rPr>
+      </w:pPr>
+    </w:p>
+    <w:p>
+      <w:pPr>
+        <w:pStyle w:val="IT245"/>
+        <w:spacing w:before="0" w:line="276" w:lineRule="auto"/>
+        <w:rPr>
+          <w:color w:val="0070C0"/>
+        </w:rPr>
+      </w:pPr>
+      <w:r>
+        <w:rPr>
+          <w:color w:val="0070C0"/>
         </w:rPr>
         <w:t xml:space="preserve">        for (Task task : tasks) {</w:t>
       </w:r>
@@ -7375,13 +7264,11 @@
         <w:spacing w:before="0" w:line="276" w:lineRule="auto"/>
         <w:rPr>
           <w:color w:val="0070C0"/>
-          <w:lang/>
-        </w:rPr>
-      </w:pPr>
-      <w:r>
-        <w:rPr>
-          <w:color w:val="0070C0"/>
-          <w:lang/>
+        </w:rPr>
+      </w:pPr>
+      <w:r>
+        <w:rPr>
+          <w:color w:val="0070C0"/>
         </w:rPr>
         <w:t xml:space="preserve">            System.out.println(task);</w:t>
       </w:r>
@@ -7392,13 +7279,11 @@
         <w:spacing w:before="0" w:line="276" w:lineRule="auto"/>
         <w:rPr>
           <w:color w:val="0070C0"/>
-          <w:lang/>
-        </w:rPr>
-      </w:pPr>
-      <w:r>
-        <w:rPr>
-          <w:color w:val="0070C0"/>
-          <w:lang/>
+        </w:rPr>
+      </w:pPr>
+      <w:r>
+        <w:rPr>
+          <w:color w:val="0070C0"/>
         </w:rPr>
         <w:t xml:space="preserve">        }</w:t>
       </w:r>
@@ -7409,13 +7294,11 @@
         <w:spacing w:before="0" w:line="276" w:lineRule="auto"/>
         <w:rPr>
           <w:color w:val="0070C0"/>
-          <w:lang/>
-        </w:rPr>
-      </w:pPr>
-      <w:r>
-        <w:rPr>
-          <w:color w:val="0070C0"/>
-          <w:lang/>
+        </w:rPr>
+      </w:pPr>
+      <w:r>
+        <w:rPr>
+          <w:color w:val="0070C0"/>
         </w:rPr>
         <w:t xml:space="preserve">    }</w:t>
       </w:r>
@@ -7426,23 +7309,20 @@
         <w:spacing w:before="0" w:line="276" w:lineRule="auto"/>
         <w:rPr>
           <w:color w:val="0070C0"/>
-          <w:lang/>
-        </w:rPr>
-      </w:pPr>
-    </w:p>
-    <w:p>
-      <w:pPr>
-        <w:pStyle w:val="IT245"/>
-        <w:spacing w:before="0" w:line="276" w:lineRule="auto"/>
-        <w:rPr>
-          <w:color w:val="0070C0"/>
-          <w:lang/>
-        </w:rPr>
-      </w:pPr>
-      <w:r>
-        <w:rPr>
-          <w:color w:val="0070C0"/>
-          <w:lang/>
+        </w:rPr>
+      </w:pPr>
+    </w:p>
+    <w:p>
+      <w:pPr>
+        <w:pStyle w:val="IT245"/>
+        <w:spacing w:before="0" w:line="276" w:lineRule="auto"/>
+        <w:rPr>
+          <w:color w:val="0070C0"/>
+        </w:rPr>
+      </w:pPr>
+      <w:r>
+        <w:rPr>
+          <w:color w:val="0070C0"/>
         </w:rPr>
         <w:t xml:space="preserve">    public boolean isEmpty() {</w:t>
       </w:r>
@@ -7453,13 +7333,11 @@
         <w:spacing w:before="0" w:line="276" w:lineRule="auto"/>
         <w:rPr>
           <w:color w:val="0070C0"/>
-          <w:lang/>
-        </w:rPr>
-      </w:pPr>
-      <w:r>
-        <w:rPr>
-          <w:color w:val="0070C0"/>
-          <w:lang/>
+        </w:rPr>
+      </w:pPr>
+      <w:r>
+        <w:rPr>
+          <w:color w:val="0070C0"/>
         </w:rPr>
         <w:t xml:space="preserve">        return tasks.isEmpty();</w:t>
       </w:r>
@@ -7470,13 +7348,11 @@
         <w:spacing w:before="0" w:line="276" w:lineRule="auto"/>
         <w:rPr>
           <w:color w:val="0070C0"/>
-          <w:lang/>
-        </w:rPr>
-      </w:pPr>
-      <w:r>
-        <w:rPr>
-          <w:color w:val="0070C0"/>
-          <w:lang/>
+        </w:rPr>
+      </w:pPr>
+      <w:r>
+        <w:rPr>
+          <w:color w:val="0070C0"/>
         </w:rPr>
         <w:t xml:space="preserve">    }</w:t>
       </w:r>
@@ -7487,13 +7363,11 @@
         <w:spacing w:before="0" w:line="276" w:lineRule="auto"/>
         <w:rPr>
           <w:color w:val="0070C0"/>
-          <w:lang/>
-        </w:rPr>
-      </w:pPr>
-      <w:r>
-        <w:rPr>
-          <w:color w:val="0070C0"/>
-          <w:lang/>
+        </w:rPr>
+      </w:pPr>
+      <w:r>
+        <w:rPr>
+          <w:color w:val="0070C0"/>
         </w:rPr>
         <w:t>}</w:t>
       </w:r>
@@ -7501,22 +7375,15 @@
     <w:p>
       <w:pPr>
         <w:pStyle w:val="IT245"/>
-        <w:rPr>
-          <w:lang/>
-        </w:rPr>
-      </w:pPr>
-    </w:p>
-    <w:p>
-      <w:pPr>
-        <w:pStyle w:val="IT245"/>
-        <w:rPr>
-          <w:lang/>
-        </w:rPr>
+      </w:pPr>
+    </w:p>
+    <w:p>
+      <w:pPr>
+        <w:pStyle w:val="IT245"/>
       </w:pPr>
       <w:r>
         <w:rPr>
           <w:b/>
-          <w:lang/>
         </w:rPr>
         <w:t>4. Second Solution Using a Data Structure</w:t>
       </w:r>
@@ -7524,34 +7391,19 @@
     <w:p>
       <w:pPr>
         <w:pStyle w:val="IT245"/>
-        <w:rPr>
-          <w:lang/>
-        </w:rPr>
-      </w:pPr>
-      <w:r>
-        <w:rPr>
-          <w:lang/>
-        </w:rPr>
+      </w:pPr>
+      <w:r>
         <w:t>The second solution uses a PriorityQueue implemented through a binary heap. This structure is suitable for the Task Scheduling System because it keeps the most urgent task available at the front of the queue without requiring the entire collection to remain fully sorted.</w:t>
       </w:r>
     </w:p>
     <w:p>
       <w:pPr>
         <w:pStyle w:val="IT245"/>
-        <w:rPr>
-          <w:lang/>
-        </w:rPr>
-      </w:pPr>
-      <w:r>
-        <w:rPr>
-          <w:lang/>
-        </w:rPr>
+      </w:pPr>
+      <w:r>
         <w:t xml:space="preserve">Each task contains an ID, name, priority level, and arrival order. A comparator is used to control how tasks are arranged. The comparator first compares priority values. A </w:t>
       </w:r>
       <w:r>
-        <w:rPr>
-          <w:lang/>
-        </w:rPr>
         <w:lastRenderedPageBreak/>
         <w:t>smaller priority number represents a more urgent task. When two tasks have the same priority, their arrival order is compared so that the earlier task is processed first.</w:t>
       </w:r>
@@ -7559,38 +7411,27 @@
     <w:p>
       <w:pPr>
         <w:pStyle w:val="IT245"/>
-        <w:rPr>
-          <w:lang/>
-        </w:rPr>
-      </w:pPr>
-      <w:r>
-        <w:rPr>
-          <w:lang/>
-        </w:rPr>
+      </w:pPr>
+      <w:r>
         <w:t>The main benefit of this solution is that the highest-priority task remains at the root of the heap. The system can therefore view the next task efficiently using peek() and remove it using poll().</w:t>
       </w:r>
     </w:p>
     <w:p>
       <w:pPr>
         <w:pStyle w:val="IT245"/>
-        <w:rPr>
-          <w:lang/>
-        </w:rPr>
-      </w:pPr>
-    </w:p>
-    <w:p>
-      <w:pPr>
-        <w:pStyle w:val="IT245"/>
-        <w:spacing w:before="0" w:line="276" w:lineRule="auto"/>
-        <w:rPr>
-          <w:color w:val="0070C0"/>
-          <w:lang/>
-        </w:rPr>
-      </w:pPr>
-      <w:r>
-        <w:rPr>
-          <w:color w:val="0070C0"/>
-          <w:lang/>
+      </w:pPr>
+    </w:p>
+    <w:p>
+      <w:pPr>
+        <w:pStyle w:val="IT245"/>
+        <w:spacing w:before="0" w:line="276" w:lineRule="auto"/>
+        <w:rPr>
+          <w:color w:val="0070C0"/>
+        </w:rPr>
+      </w:pPr>
+      <w:r>
+        <w:rPr>
+          <w:color w:val="0070C0"/>
         </w:rPr>
         <w:t>import java.util.Comparator;</w:t>
       </w:r>
@@ -7601,13 +7442,11 @@
         <w:spacing w:before="0" w:line="276" w:lineRule="auto"/>
         <w:rPr>
           <w:color w:val="0070C0"/>
-          <w:lang/>
-        </w:rPr>
-      </w:pPr>
-      <w:r>
-        <w:rPr>
-          <w:color w:val="0070C0"/>
-          <w:lang/>
+        </w:rPr>
+      </w:pPr>
+      <w:r>
+        <w:rPr>
+          <w:color w:val="0070C0"/>
         </w:rPr>
         <w:t>import java.util.PriorityQueue;</w:t>
       </w:r>
@@ -7618,23 +7457,20 @@
         <w:spacing w:before="0" w:line="276" w:lineRule="auto"/>
         <w:rPr>
           <w:color w:val="0070C0"/>
-          <w:lang/>
-        </w:rPr>
-      </w:pPr>
-    </w:p>
-    <w:p>
-      <w:pPr>
-        <w:pStyle w:val="IT245"/>
-        <w:spacing w:before="0" w:line="276" w:lineRule="auto"/>
-        <w:rPr>
-          <w:color w:val="0070C0"/>
-          <w:lang/>
-        </w:rPr>
-      </w:pPr>
-      <w:r>
-        <w:rPr>
-          <w:color w:val="0070C0"/>
-          <w:lang/>
+        </w:rPr>
+      </w:pPr>
+    </w:p>
+    <w:p>
+      <w:pPr>
+        <w:pStyle w:val="IT245"/>
+        <w:spacing w:before="0" w:line="276" w:lineRule="auto"/>
+        <w:rPr>
+          <w:color w:val="0070C0"/>
+        </w:rPr>
+      </w:pPr>
+      <w:r>
+        <w:rPr>
+          <w:color w:val="0070C0"/>
         </w:rPr>
         <w:t>class HeapTaskScheduler {</w:t>
       </w:r>
@@ -7645,13 +7481,11 @@
         <w:spacing w:before="0" w:line="276" w:lineRule="auto"/>
         <w:rPr>
           <w:color w:val="0070C0"/>
-          <w:lang/>
-        </w:rPr>
-      </w:pPr>
-      <w:r>
-        <w:rPr>
-          <w:color w:val="0070C0"/>
-          <w:lang/>
+        </w:rPr>
+      </w:pPr>
+      <w:r>
+        <w:rPr>
+          <w:color w:val="0070C0"/>
         </w:rPr>
         <w:t xml:space="preserve">    private PriorityQueue&lt;Task&gt; tasks;</w:t>
       </w:r>
@@ -7662,13 +7496,11 @@
         <w:spacing w:before="0" w:line="276" w:lineRule="auto"/>
         <w:rPr>
           <w:color w:val="0070C0"/>
-          <w:lang/>
-        </w:rPr>
-      </w:pPr>
-      <w:r>
-        <w:rPr>
-          <w:color w:val="0070C0"/>
-          <w:lang/>
+        </w:rPr>
+      </w:pPr>
+      <w:r>
+        <w:rPr>
+          <w:color w:val="0070C0"/>
         </w:rPr>
         <w:t xml:space="preserve">    private long sequence = 0;</w:t>
       </w:r>
@@ -7679,23 +7511,20 @@
         <w:spacing w:before="0" w:line="276" w:lineRule="auto"/>
         <w:rPr>
           <w:color w:val="0070C0"/>
-          <w:lang/>
-        </w:rPr>
-      </w:pPr>
-    </w:p>
-    <w:p>
-      <w:pPr>
-        <w:pStyle w:val="IT245"/>
-        <w:spacing w:before="0" w:line="276" w:lineRule="auto"/>
-        <w:rPr>
-          <w:color w:val="0070C0"/>
-          <w:lang/>
-        </w:rPr>
-      </w:pPr>
-      <w:r>
-        <w:rPr>
-          <w:color w:val="0070C0"/>
-          <w:lang/>
+        </w:rPr>
+      </w:pPr>
+    </w:p>
+    <w:p>
+      <w:pPr>
+        <w:pStyle w:val="IT245"/>
+        <w:spacing w:before="0" w:line="276" w:lineRule="auto"/>
+        <w:rPr>
+          <w:color w:val="0070C0"/>
+        </w:rPr>
+      </w:pPr>
+      <w:r>
+        <w:rPr>
+          <w:color w:val="0070C0"/>
         </w:rPr>
         <w:t xml:space="preserve">    public HeapTaskScheduler() {</w:t>
       </w:r>
@@ -7706,13 +7535,11 @@
         <w:spacing w:before="0" w:line="276" w:lineRule="auto"/>
         <w:rPr>
           <w:color w:val="0070C0"/>
-          <w:lang/>
-        </w:rPr>
-      </w:pPr>
-      <w:r>
-        <w:rPr>
-          <w:color w:val="0070C0"/>
-          <w:lang/>
+        </w:rPr>
+      </w:pPr>
+      <w:r>
+        <w:rPr>
+          <w:color w:val="0070C0"/>
         </w:rPr>
         <w:t xml:space="preserve">        tasks = new PriorityQueue&lt;&gt;(</w:t>
       </w:r>
@@ -7723,13 +7550,11 @@
         <w:spacing w:before="0" w:line="276" w:lineRule="auto"/>
         <w:rPr>
           <w:color w:val="0070C0"/>
-          <w:lang/>
-        </w:rPr>
-      </w:pPr>
-      <w:r>
-        <w:rPr>
-          <w:color w:val="0070C0"/>
-          <w:lang/>
+        </w:rPr>
+      </w:pPr>
+      <w:r>
+        <w:rPr>
+          <w:color w:val="0070C0"/>
         </w:rPr>
         <w:t xml:space="preserve">            Comparator.comparingInt(Task::getPriority)</w:t>
       </w:r>
@@ -7740,13 +7565,11 @@
         <w:spacing w:before="0" w:line="276" w:lineRule="auto"/>
         <w:rPr>
           <w:color w:val="0070C0"/>
-          <w:lang/>
-        </w:rPr>
-      </w:pPr>
-      <w:r>
-        <w:rPr>
-          <w:color w:val="0070C0"/>
-          <w:lang/>
+        </w:rPr>
+      </w:pPr>
+      <w:r>
+        <w:rPr>
+          <w:color w:val="0070C0"/>
         </w:rPr>
         <w:t xml:space="preserve">                      .thenComparingLong(Task::getArrivalOrder)</w:t>
       </w:r>
@@ -7757,13 +7580,11 @@
         <w:spacing w:before="0" w:line="276" w:lineRule="auto"/>
         <w:rPr>
           <w:color w:val="0070C0"/>
-          <w:lang/>
-        </w:rPr>
-      </w:pPr>
-      <w:r>
-        <w:rPr>
-          <w:color w:val="0070C0"/>
-          <w:lang/>
+        </w:rPr>
+      </w:pPr>
+      <w:r>
+        <w:rPr>
+          <w:color w:val="0070C0"/>
         </w:rPr>
         <w:t xml:space="preserve">        );</w:t>
       </w:r>
@@ -7774,13 +7595,11 @@
         <w:spacing w:before="0" w:line="276" w:lineRule="auto"/>
         <w:rPr>
           <w:color w:val="0070C0"/>
-          <w:lang/>
-        </w:rPr>
-      </w:pPr>
-      <w:r>
-        <w:rPr>
-          <w:color w:val="0070C0"/>
-          <w:lang/>
+        </w:rPr>
+      </w:pPr>
+      <w:r>
+        <w:rPr>
+          <w:color w:val="0070C0"/>
         </w:rPr>
         <w:t xml:space="preserve">    }</w:t>
       </w:r>
@@ -7791,23 +7610,20 @@
         <w:spacing w:before="0" w:line="276" w:lineRule="auto"/>
         <w:rPr>
           <w:color w:val="0070C0"/>
-          <w:lang/>
-        </w:rPr>
-      </w:pPr>
-    </w:p>
-    <w:p>
-      <w:pPr>
-        <w:pStyle w:val="IT245"/>
-        <w:spacing w:before="0" w:line="276" w:lineRule="auto"/>
-        <w:rPr>
-          <w:color w:val="0070C0"/>
-          <w:lang/>
-        </w:rPr>
-      </w:pPr>
-      <w:r>
-        <w:rPr>
-          <w:color w:val="0070C0"/>
-          <w:lang/>
+        </w:rPr>
+      </w:pPr>
+    </w:p>
+    <w:p>
+      <w:pPr>
+        <w:pStyle w:val="IT245"/>
+        <w:spacing w:before="0" w:line="276" w:lineRule="auto"/>
+        <w:rPr>
+          <w:color w:val="0070C0"/>
+        </w:rPr>
+      </w:pPr>
+      <w:r>
+        <w:rPr>
+          <w:color w:val="0070C0"/>
         </w:rPr>
         <w:t xml:space="preserve">    public void addTask(int id, String name, int priority) {</w:t>
       </w:r>
@@ -7818,13 +7634,11 @@
         <w:spacing w:before="0" w:line="276" w:lineRule="auto"/>
         <w:rPr>
           <w:color w:val="0070C0"/>
-          <w:lang/>
-        </w:rPr>
-      </w:pPr>
-      <w:r>
-        <w:rPr>
-          <w:color w:val="0070C0"/>
-          <w:lang/>
+        </w:rPr>
+      </w:pPr>
+      <w:r>
+        <w:rPr>
+          <w:color w:val="0070C0"/>
         </w:rPr>
         <w:t xml:space="preserve">        if (name == null || name.trim().isEmpty()) {</w:t>
       </w:r>
@@ -7835,13 +7649,11 @@
         <w:spacing w:before="0" w:line="276" w:lineRule="auto"/>
         <w:rPr>
           <w:color w:val="0070C0"/>
-          <w:lang/>
-        </w:rPr>
-      </w:pPr>
-      <w:r>
-        <w:rPr>
-          <w:color w:val="0070C0"/>
-          <w:lang/>
+        </w:rPr>
+      </w:pPr>
+      <w:r>
+        <w:rPr>
+          <w:color w:val="0070C0"/>
         </w:rPr>
         <w:t xml:space="preserve">            System.out.println("Task name cannot be empty.");</w:t>
       </w:r>
@@ -7852,13 +7664,11 @@
         <w:spacing w:before="0" w:line="276" w:lineRule="auto"/>
         <w:rPr>
           <w:color w:val="0070C0"/>
-          <w:lang/>
-        </w:rPr>
-      </w:pPr>
-      <w:r>
-        <w:rPr>
-          <w:color w:val="0070C0"/>
-          <w:lang/>
+        </w:rPr>
+      </w:pPr>
+      <w:r>
+        <w:rPr>
+          <w:color w:val="0070C0"/>
         </w:rPr>
         <w:t xml:space="preserve">            return;</w:t>
       </w:r>
@@ -7869,13 +7679,11 @@
         <w:spacing w:before="0" w:line="276" w:lineRule="auto"/>
         <w:rPr>
           <w:color w:val="0070C0"/>
-          <w:lang/>
-        </w:rPr>
-      </w:pPr>
-      <w:r>
-        <w:rPr>
-          <w:color w:val="0070C0"/>
-          <w:lang/>
+        </w:rPr>
+      </w:pPr>
+      <w:r>
+        <w:rPr>
+          <w:color w:val="0070C0"/>
         </w:rPr>
         <w:t xml:space="preserve">        }</w:t>
       </w:r>
@@ -7886,23 +7694,20 @@
         <w:spacing w:before="0" w:line="276" w:lineRule="auto"/>
         <w:rPr>
           <w:color w:val="0070C0"/>
-          <w:lang/>
-        </w:rPr>
-      </w:pPr>
-    </w:p>
-    <w:p>
-      <w:pPr>
-        <w:pStyle w:val="IT245"/>
-        <w:spacing w:before="0" w:line="276" w:lineRule="auto"/>
-        <w:rPr>
-          <w:color w:val="0070C0"/>
-          <w:lang/>
-        </w:rPr>
-      </w:pPr>
-      <w:r>
-        <w:rPr>
-          <w:color w:val="0070C0"/>
-          <w:lang/>
+        </w:rPr>
+      </w:pPr>
+    </w:p>
+    <w:p>
+      <w:pPr>
+        <w:pStyle w:val="IT245"/>
+        <w:spacing w:before="0" w:line="276" w:lineRule="auto"/>
+        <w:rPr>
+          <w:color w:val="0070C0"/>
+        </w:rPr>
+      </w:pPr>
+      <w:r>
+        <w:rPr>
+          <w:color w:val="0070C0"/>
         </w:rPr>
         <w:t xml:space="preserve">        if (priority &lt; 1) {</w:t>
       </w:r>
@@ -7913,13 +7718,11 @@
         <w:spacing w:before="0" w:line="276" w:lineRule="auto"/>
         <w:rPr>
           <w:color w:val="0070C0"/>
-          <w:lang/>
-        </w:rPr>
-      </w:pPr>
-      <w:r>
-        <w:rPr>
-          <w:color w:val="0070C0"/>
-          <w:lang/>
+        </w:rPr>
+      </w:pPr>
+      <w:r>
+        <w:rPr>
+          <w:color w:val="0070C0"/>
         </w:rPr>
         <w:t xml:space="preserve">            System.out.println("Priority must be 1 or greater.");</w:t>
       </w:r>
@@ -7930,13 +7733,11 @@
         <w:spacing w:before="0" w:line="276" w:lineRule="auto"/>
         <w:rPr>
           <w:color w:val="0070C0"/>
-          <w:lang/>
-        </w:rPr>
-      </w:pPr>
-      <w:r>
-        <w:rPr>
-          <w:color w:val="0070C0"/>
-          <w:lang/>
+        </w:rPr>
+      </w:pPr>
+      <w:r>
+        <w:rPr>
+          <w:color w:val="0070C0"/>
         </w:rPr>
         <w:t xml:space="preserve">            return;</w:t>
       </w:r>
@@ -7947,13 +7748,11 @@
         <w:spacing w:before="0" w:line="276" w:lineRule="auto"/>
         <w:rPr>
           <w:color w:val="0070C0"/>
-          <w:lang/>
-        </w:rPr>
-      </w:pPr>
-      <w:r>
-        <w:rPr>
-          <w:color w:val="0070C0"/>
-          <w:lang/>
+        </w:rPr>
+      </w:pPr>
+      <w:r>
+        <w:rPr>
+          <w:color w:val="0070C0"/>
         </w:rPr>
         <w:t xml:space="preserve">        }</w:t>
       </w:r>
@@ -7964,23 +7763,20 @@
         <w:spacing w:before="0" w:line="276" w:lineRule="auto"/>
         <w:rPr>
           <w:color w:val="0070C0"/>
-          <w:lang/>
-        </w:rPr>
-      </w:pPr>
-    </w:p>
-    <w:p>
-      <w:pPr>
-        <w:pStyle w:val="IT245"/>
-        <w:spacing w:before="0" w:line="276" w:lineRule="auto"/>
-        <w:rPr>
-          <w:color w:val="0070C0"/>
-          <w:lang/>
-        </w:rPr>
-      </w:pPr>
-      <w:r>
-        <w:rPr>
-          <w:color w:val="0070C0"/>
-          <w:lang/>
+        </w:rPr>
+      </w:pPr>
+    </w:p>
+    <w:p>
+      <w:pPr>
+        <w:pStyle w:val="IT245"/>
+        <w:spacing w:before="0" w:line="276" w:lineRule="auto"/>
+        <w:rPr>
+          <w:color w:val="0070C0"/>
+        </w:rPr>
+      </w:pPr>
+      <w:r>
+        <w:rPr>
+          <w:color w:val="0070C0"/>
         </w:rPr>
         <w:t xml:space="preserve">        tasks.offer(new Task(id, name, priority, sequence++));</w:t>
       </w:r>
@@ -7991,13 +7787,11 @@
         <w:spacing w:before="0" w:line="276" w:lineRule="auto"/>
         <w:rPr>
           <w:color w:val="0070C0"/>
-          <w:lang/>
-        </w:rPr>
-      </w:pPr>
-      <w:r>
-        <w:rPr>
-          <w:color w:val="0070C0"/>
-          <w:lang/>
+        </w:rPr>
+      </w:pPr>
+      <w:r>
+        <w:rPr>
+          <w:color w:val="0070C0"/>
         </w:rPr>
         <w:lastRenderedPageBreak/>
         <w:t xml:space="preserve">    }</w:t>
@@ -8009,23 +7803,20 @@
         <w:spacing w:before="0" w:line="276" w:lineRule="auto"/>
         <w:rPr>
           <w:color w:val="0070C0"/>
-          <w:lang/>
-        </w:rPr>
-      </w:pPr>
-    </w:p>
-    <w:p>
-      <w:pPr>
-        <w:pStyle w:val="IT245"/>
-        <w:spacing w:before="0" w:line="276" w:lineRule="auto"/>
-        <w:rPr>
-          <w:color w:val="0070C0"/>
-          <w:lang/>
-        </w:rPr>
-      </w:pPr>
-      <w:r>
-        <w:rPr>
-          <w:color w:val="0070C0"/>
-          <w:lang/>
+        </w:rPr>
+      </w:pPr>
+    </w:p>
+    <w:p>
+      <w:pPr>
+        <w:pStyle w:val="IT245"/>
+        <w:spacing w:before="0" w:line="276" w:lineRule="auto"/>
+        <w:rPr>
+          <w:color w:val="0070C0"/>
+        </w:rPr>
+      </w:pPr>
+      <w:r>
+        <w:rPr>
+          <w:color w:val="0070C0"/>
         </w:rPr>
         <w:t xml:space="preserve">    public Task viewNextTask() {</w:t>
       </w:r>
@@ -8036,13 +7827,11 @@
         <w:spacing w:before="0" w:line="276" w:lineRule="auto"/>
         <w:rPr>
           <w:color w:val="0070C0"/>
-          <w:lang/>
-        </w:rPr>
-      </w:pPr>
-      <w:r>
-        <w:rPr>
-          <w:color w:val="0070C0"/>
-          <w:lang/>
+        </w:rPr>
+      </w:pPr>
+      <w:r>
+        <w:rPr>
+          <w:color w:val="0070C0"/>
         </w:rPr>
         <w:t xml:space="preserve">        return tasks.peek();</w:t>
       </w:r>
@@ -8053,13 +7842,11 @@
         <w:spacing w:before="0" w:line="276" w:lineRule="auto"/>
         <w:rPr>
           <w:color w:val="0070C0"/>
-          <w:lang/>
-        </w:rPr>
-      </w:pPr>
-      <w:r>
-        <w:rPr>
-          <w:color w:val="0070C0"/>
-          <w:lang/>
+        </w:rPr>
+      </w:pPr>
+      <w:r>
+        <w:rPr>
+          <w:color w:val="0070C0"/>
         </w:rPr>
         <w:t xml:space="preserve">    }</w:t>
       </w:r>
@@ -8070,23 +7857,20 @@
         <w:spacing w:before="0" w:line="276" w:lineRule="auto"/>
         <w:rPr>
           <w:color w:val="0070C0"/>
-          <w:lang/>
-        </w:rPr>
-      </w:pPr>
-    </w:p>
-    <w:p>
-      <w:pPr>
-        <w:pStyle w:val="IT245"/>
-        <w:spacing w:before="0" w:line="276" w:lineRule="auto"/>
-        <w:rPr>
-          <w:color w:val="0070C0"/>
-          <w:lang/>
-        </w:rPr>
-      </w:pPr>
-      <w:r>
-        <w:rPr>
-          <w:color w:val="0070C0"/>
-          <w:lang/>
+        </w:rPr>
+      </w:pPr>
+    </w:p>
+    <w:p>
+      <w:pPr>
+        <w:pStyle w:val="IT245"/>
+        <w:spacing w:before="0" w:line="276" w:lineRule="auto"/>
+        <w:rPr>
+          <w:color w:val="0070C0"/>
+        </w:rPr>
+      </w:pPr>
+      <w:r>
+        <w:rPr>
+          <w:color w:val="0070C0"/>
         </w:rPr>
         <w:t xml:space="preserve">    public Task processNextTask() {</w:t>
       </w:r>
@@ -8097,13 +7881,11 @@
         <w:spacing w:before="0" w:line="276" w:lineRule="auto"/>
         <w:rPr>
           <w:color w:val="0070C0"/>
-          <w:lang/>
-        </w:rPr>
-      </w:pPr>
-      <w:r>
-        <w:rPr>
-          <w:color w:val="0070C0"/>
-          <w:lang/>
+        </w:rPr>
+      </w:pPr>
+      <w:r>
+        <w:rPr>
+          <w:color w:val="0070C0"/>
         </w:rPr>
         <w:t xml:space="preserve">        return tasks.poll();</w:t>
       </w:r>
@@ -8114,13 +7896,11 @@
         <w:spacing w:before="0" w:line="276" w:lineRule="auto"/>
         <w:rPr>
           <w:color w:val="0070C0"/>
-          <w:lang/>
-        </w:rPr>
-      </w:pPr>
-      <w:r>
-        <w:rPr>
-          <w:color w:val="0070C0"/>
-          <w:lang/>
+        </w:rPr>
+      </w:pPr>
+      <w:r>
+        <w:rPr>
+          <w:color w:val="0070C0"/>
         </w:rPr>
         <w:t xml:space="preserve">    }</w:t>
       </w:r>
@@ -8131,23 +7911,20 @@
         <w:spacing w:before="0" w:line="276" w:lineRule="auto"/>
         <w:rPr>
           <w:color w:val="0070C0"/>
-          <w:lang/>
-        </w:rPr>
-      </w:pPr>
-    </w:p>
-    <w:p>
-      <w:pPr>
-        <w:pStyle w:val="IT245"/>
-        <w:spacing w:before="0" w:line="276" w:lineRule="auto"/>
-        <w:rPr>
-          <w:color w:val="0070C0"/>
-          <w:lang/>
-        </w:rPr>
-      </w:pPr>
-      <w:r>
-        <w:rPr>
-          <w:color w:val="0070C0"/>
-          <w:lang/>
+        </w:rPr>
+      </w:pPr>
+    </w:p>
+    <w:p>
+      <w:pPr>
+        <w:pStyle w:val="IT245"/>
+        <w:spacing w:before="0" w:line="276" w:lineRule="auto"/>
+        <w:rPr>
+          <w:color w:val="0070C0"/>
+        </w:rPr>
+      </w:pPr>
+      <w:r>
+        <w:rPr>
+          <w:color w:val="0070C0"/>
         </w:rPr>
         <w:t xml:space="preserve">    public void displayTasks() {</w:t>
       </w:r>
@@ -8158,13 +7935,11 @@
         <w:spacing w:before="0" w:line="276" w:lineRule="auto"/>
         <w:rPr>
           <w:color w:val="0070C0"/>
-          <w:lang/>
-        </w:rPr>
-      </w:pPr>
-      <w:r>
-        <w:rPr>
-          <w:color w:val="0070C0"/>
-          <w:lang/>
+        </w:rPr>
+      </w:pPr>
+      <w:r>
+        <w:rPr>
+          <w:color w:val="0070C0"/>
         </w:rPr>
         <w:t xml:space="preserve">        if (tasks.isEmpty()) {</w:t>
       </w:r>
@@ -8175,13 +7950,11 @@
         <w:spacing w:before="0" w:line="276" w:lineRule="auto"/>
         <w:rPr>
           <w:color w:val="0070C0"/>
-          <w:lang/>
-        </w:rPr>
-      </w:pPr>
-      <w:r>
-        <w:rPr>
-          <w:color w:val="0070C0"/>
-          <w:lang/>
+        </w:rPr>
+      </w:pPr>
+      <w:r>
+        <w:rPr>
+          <w:color w:val="0070C0"/>
         </w:rPr>
         <w:t xml:space="preserve">            System.out.println("No pending tasks.");</w:t>
       </w:r>
@@ -8192,13 +7965,11 @@
         <w:spacing w:before="0" w:line="276" w:lineRule="auto"/>
         <w:rPr>
           <w:color w:val="0070C0"/>
-          <w:lang/>
-        </w:rPr>
-      </w:pPr>
-      <w:r>
-        <w:rPr>
-          <w:color w:val="0070C0"/>
-          <w:lang/>
+        </w:rPr>
+      </w:pPr>
+      <w:r>
+        <w:rPr>
+          <w:color w:val="0070C0"/>
         </w:rPr>
         <w:t xml:space="preserve">            return;</w:t>
       </w:r>
@@ -8209,13 +7980,11 @@
         <w:spacing w:before="0" w:line="276" w:lineRule="auto"/>
         <w:rPr>
           <w:color w:val="0070C0"/>
-          <w:lang/>
-        </w:rPr>
-      </w:pPr>
-      <w:r>
-        <w:rPr>
-          <w:color w:val="0070C0"/>
-          <w:lang/>
+        </w:rPr>
+      </w:pPr>
+      <w:r>
+        <w:rPr>
+          <w:color w:val="0070C0"/>
         </w:rPr>
         <w:t xml:space="preserve">        }</w:t>
       </w:r>
@@ -8226,23 +7995,20 @@
         <w:spacing w:before="0" w:line="276" w:lineRule="auto"/>
         <w:rPr>
           <w:color w:val="0070C0"/>
-          <w:lang/>
-        </w:rPr>
-      </w:pPr>
-    </w:p>
-    <w:p>
-      <w:pPr>
-        <w:pStyle w:val="IT245"/>
-        <w:spacing w:before="0" w:line="276" w:lineRule="auto"/>
-        <w:rPr>
-          <w:color w:val="0070C0"/>
-          <w:lang/>
-        </w:rPr>
-      </w:pPr>
-      <w:r>
-        <w:rPr>
-          <w:color w:val="0070C0"/>
-          <w:lang/>
+        </w:rPr>
+      </w:pPr>
+    </w:p>
+    <w:p>
+      <w:pPr>
+        <w:pStyle w:val="IT245"/>
+        <w:spacing w:before="0" w:line="276" w:lineRule="auto"/>
+        <w:rPr>
+          <w:color w:val="0070C0"/>
+        </w:rPr>
+      </w:pPr>
+      <w:r>
+        <w:rPr>
+          <w:color w:val="0070C0"/>
         </w:rPr>
         <w:t xml:space="preserve">        PriorityQueue&lt;Task&gt; copy = new PriorityQueue&lt;&gt;(tasks);</w:t>
       </w:r>
@@ -8253,23 +8019,20 @@
         <w:spacing w:before="0" w:line="276" w:lineRule="auto"/>
         <w:rPr>
           <w:color w:val="0070C0"/>
-          <w:lang/>
-        </w:rPr>
-      </w:pPr>
-    </w:p>
-    <w:p>
-      <w:pPr>
-        <w:pStyle w:val="IT245"/>
-        <w:spacing w:before="0" w:line="276" w:lineRule="auto"/>
-        <w:rPr>
-          <w:color w:val="0070C0"/>
-          <w:lang/>
-        </w:rPr>
-      </w:pPr>
-      <w:r>
-        <w:rPr>
-          <w:color w:val="0070C0"/>
-          <w:lang/>
+        </w:rPr>
+      </w:pPr>
+    </w:p>
+    <w:p>
+      <w:pPr>
+        <w:pStyle w:val="IT245"/>
+        <w:spacing w:before="0" w:line="276" w:lineRule="auto"/>
+        <w:rPr>
+          <w:color w:val="0070C0"/>
+        </w:rPr>
+      </w:pPr>
+      <w:r>
+        <w:rPr>
+          <w:color w:val="0070C0"/>
         </w:rPr>
         <w:t xml:space="preserve">        while (!copy.isEmpty()) {</w:t>
       </w:r>
@@ -8280,13 +8043,11 @@
         <w:spacing w:before="0" w:line="276" w:lineRule="auto"/>
         <w:rPr>
           <w:color w:val="0070C0"/>
-          <w:lang/>
-        </w:rPr>
-      </w:pPr>
-      <w:r>
-        <w:rPr>
-          <w:color w:val="0070C0"/>
-          <w:lang/>
+        </w:rPr>
+      </w:pPr>
+      <w:r>
+        <w:rPr>
+          <w:color w:val="0070C0"/>
         </w:rPr>
         <w:t xml:space="preserve">            System.out.println(copy.poll());</w:t>
       </w:r>
@@ -8297,13 +8058,11 @@
         <w:spacing w:before="0" w:line="276" w:lineRule="auto"/>
         <w:rPr>
           <w:color w:val="0070C0"/>
-          <w:lang/>
-        </w:rPr>
-      </w:pPr>
-      <w:r>
-        <w:rPr>
-          <w:color w:val="0070C0"/>
-          <w:lang/>
+        </w:rPr>
+      </w:pPr>
+      <w:r>
+        <w:rPr>
+          <w:color w:val="0070C0"/>
         </w:rPr>
         <w:t xml:space="preserve">        }</w:t>
       </w:r>
@@ -8314,13 +8073,11 @@
         <w:spacing w:before="0" w:line="276" w:lineRule="auto"/>
         <w:rPr>
           <w:color w:val="0070C0"/>
-          <w:lang/>
-        </w:rPr>
-      </w:pPr>
-      <w:r>
-        <w:rPr>
-          <w:color w:val="0070C0"/>
-          <w:lang/>
+        </w:rPr>
+      </w:pPr>
+      <w:r>
+        <w:rPr>
+          <w:color w:val="0070C0"/>
         </w:rPr>
         <w:t xml:space="preserve">    }</w:t>
       </w:r>
@@ -8331,23 +8088,20 @@
         <w:spacing w:before="0" w:line="276" w:lineRule="auto"/>
         <w:rPr>
           <w:color w:val="0070C0"/>
-          <w:lang/>
-        </w:rPr>
-      </w:pPr>
-    </w:p>
-    <w:p>
-      <w:pPr>
-        <w:pStyle w:val="IT245"/>
-        <w:spacing w:before="0" w:line="276" w:lineRule="auto"/>
-        <w:rPr>
-          <w:color w:val="0070C0"/>
-          <w:lang/>
-        </w:rPr>
-      </w:pPr>
-      <w:r>
-        <w:rPr>
-          <w:color w:val="0070C0"/>
-          <w:lang/>
+        </w:rPr>
+      </w:pPr>
+    </w:p>
+    <w:p>
+      <w:pPr>
+        <w:pStyle w:val="IT245"/>
+        <w:spacing w:before="0" w:line="276" w:lineRule="auto"/>
+        <w:rPr>
+          <w:color w:val="0070C0"/>
+        </w:rPr>
+      </w:pPr>
+      <w:r>
+        <w:rPr>
+          <w:color w:val="0070C0"/>
         </w:rPr>
         <w:t xml:space="preserve">    public boolean isEmpty() {</w:t>
       </w:r>
@@ -8358,13 +8112,11 @@
         <w:spacing w:before="0" w:line="276" w:lineRule="auto"/>
         <w:rPr>
           <w:color w:val="0070C0"/>
-          <w:lang/>
-        </w:rPr>
-      </w:pPr>
-      <w:r>
-        <w:rPr>
-          <w:color w:val="0070C0"/>
-          <w:lang/>
+        </w:rPr>
+      </w:pPr>
+      <w:r>
+        <w:rPr>
+          <w:color w:val="0070C0"/>
         </w:rPr>
         <w:t xml:space="preserve">        return tasks.isEmpty();</w:t>
       </w:r>
@@ -8375,13 +8127,11 @@
         <w:spacing w:before="0" w:line="276" w:lineRule="auto"/>
         <w:rPr>
           <w:color w:val="0070C0"/>
-          <w:lang/>
-        </w:rPr>
-      </w:pPr>
-      <w:r>
-        <w:rPr>
-          <w:color w:val="0070C0"/>
-          <w:lang/>
+        </w:rPr>
+      </w:pPr>
+      <w:r>
+        <w:rPr>
+          <w:color w:val="0070C0"/>
         </w:rPr>
         <w:t xml:space="preserve">    }</w:t>
       </w:r>
@@ -8392,15 +8142,1758 @@
         <w:spacing w:before="0" w:line="276" w:lineRule="auto"/>
         <w:rPr>
           <w:color w:val="0070C0"/>
-          <w:lang/>
-        </w:rPr>
-      </w:pPr>
-      <w:r>
-        <w:rPr>
-          <w:color w:val="0070C0"/>
-          <w:lang/>
+        </w:rPr>
+      </w:pPr>
+      <w:r>
+        <w:rPr>
+          <w:color w:val="0070C0"/>
         </w:rPr>
         <w:t>}</w:t>
+      </w:r>
+    </w:p>
+    <w:p>
+      <w:pPr>
+        <w:pStyle w:val="IT245"/>
+        <w:rPr>
+          <w:lang/>
+        </w:rPr>
+      </w:pPr>
+      <w:r>
+        <w:rPr>
+          <w:b/>
+          <w:lang/>
+        </w:rPr>
+        <w:t>5. Program Implementation</w:t>
+      </w:r>
+    </w:p>
+    <w:p>
+      <w:pPr>
+        <w:pStyle w:val="IT245"/>
+        <w:rPr>
+          <w:lang/>
+        </w:rPr>
+      </w:pPr>
+      <w:r>
+        <w:rPr>
+          <w:lang/>
+        </w:rPr>
+        <w:t>The program is divided into four Java classes: Main, Task, ArrayListTaskScheduler, and HeapTaskScheduler. The Main class creates and tests both scheduling solutions using the same task records. This structure keeps each data structure implementation separate while allowing both solutions to be demonstrated from one main method.</w:t>
+      </w:r>
+    </w:p>
+    <w:p>
+      <w:pPr>
+        <w:pStyle w:val="IT245"/>
+        <w:rPr>
+          <w:b/>
+          <w:lang/>
+        </w:rPr>
+      </w:pPr>
+      <w:r>
+        <w:rPr>
+          <w:b/>
+          <w:lang/>
+        </w:rPr>
+        <w:lastRenderedPageBreak/>
+        <w:t>5.1 Task Class</w:t>
+      </w:r>
+    </w:p>
+    <w:p>
+      <w:pPr>
+        <w:pStyle w:val="IT245"/>
+        <w:rPr>
+          <w:lang/>
+        </w:rPr>
+      </w:pPr>
+      <w:r>
+        <w:rPr>
+          <w:lang/>
+        </w:rPr>
+        <w:t>The Task class represents each task stored in the scheduling system. It contains the task ID, name, priority level, and arrival order. The arrival order is used when two tasks have the same priority.</w:t>
+      </w:r>
+    </w:p>
+    <w:p>
+      <w:pPr>
+        <w:pStyle w:val="IT245"/>
+        <w:spacing w:before="0" w:line="276" w:lineRule="auto"/>
+        <w:rPr>
+          <w:color w:val="0070C0"/>
+          <w:lang/>
+        </w:rPr>
+      </w:pPr>
+      <w:r>
+        <w:rPr>
+          <w:color w:val="0070C0"/>
+          <w:lang/>
+        </w:rPr>
+        <w:t>public class Task {</w:t>
+      </w:r>
+    </w:p>
+    <w:p>
+      <w:pPr>
+        <w:pStyle w:val="IT245"/>
+        <w:spacing w:before="0" w:line="276" w:lineRule="auto"/>
+        <w:rPr>
+          <w:color w:val="0070C0"/>
+          <w:lang/>
+        </w:rPr>
+      </w:pPr>
+      <w:r>
+        <w:rPr>
+          <w:color w:val="0070C0"/>
+          <w:lang/>
+        </w:rPr>
+        <w:t xml:space="preserve">    private int id;</w:t>
+      </w:r>
+    </w:p>
+    <w:p>
+      <w:pPr>
+        <w:pStyle w:val="IT245"/>
+        <w:spacing w:before="0" w:line="276" w:lineRule="auto"/>
+        <w:rPr>
+          <w:color w:val="0070C0"/>
+          <w:lang/>
+        </w:rPr>
+      </w:pPr>
+      <w:r>
+        <w:rPr>
+          <w:color w:val="0070C0"/>
+          <w:lang/>
+        </w:rPr>
+        <w:t xml:space="preserve">    private String name;</w:t>
+      </w:r>
+    </w:p>
+    <w:p>
+      <w:pPr>
+        <w:pStyle w:val="IT245"/>
+        <w:spacing w:before="0" w:line="276" w:lineRule="auto"/>
+        <w:rPr>
+          <w:color w:val="0070C0"/>
+          <w:lang/>
+        </w:rPr>
+      </w:pPr>
+      <w:r>
+        <w:rPr>
+          <w:color w:val="0070C0"/>
+          <w:lang/>
+        </w:rPr>
+        <w:t xml:space="preserve">    private int priority;</w:t>
+      </w:r>
+    </w:p>
+    <w:p>
+      <w:pPr>
+        <w:pStyle w:val="IT245"/>
+        <w:spacing w:before="0" w:line="276" w:lineRule="auto"/>
+        <w:rPr>
+          <w:color w:val="0070C0"/>
+          <w:lang/>
+        </w:rPr>
+      </w:pPr>
+      <w:r>
+        <w:rPr>
+          <w:color w:val="0070C0"/>
+          <w:lang/>
+        </w:rPr>
+        <w:t xml:space="preserve">    private long arrivalOrder;</w:t>
+      </w:r>
+    </w:p>
+    <w:p>
+      <w:pPr>
+        <w:pStyle w:val="IT245"/>
+        <w:spacing w:before="0" w:line="276" w:lineRule="auto"/>
+        <w:rPr>
+          <w:color w:val="0070C0"/>
+          <w:lang/>
+        </w:rPr>
+      </w:pPr>
+    </w:p>
+    <w:p>
+      <w:pPr>
+        <w:pStyle w:val="IT245"/>
+        <w:spacing w:before="0" w:line="276" w:lineRule="auto"/>
+        <w:rPr>
+          <w:color w:val="0070C0"/>
+          <w:lang/>
+        </w:rPr>
+      </w:pPr>
+      <w:r>
+        <w:rPr>
+          <w:color w:val="0070C0"/>
+          <w:lang/>
+        </w:rPr>
+        <w:t xml:space="preserve">    public Task(int id, String name, int priority, long arrivalOrder) {</w:t>
+      </w:r>
+    </w:p>
+    <w:p>
+      <w:pPr>
+        <w:pStyle w:val="IT245"/>
+        <w:spacing w:before="0" w:line="276" w:lineRule="auto"/>
+        <w:rPr>
+          <w:color w:val="0070C0"/>
+          <w:lang/>
+        </w:rPr>
+      </w:pPr>
+      <w:r>
+        <w:rPr>
+          <w:color w:val="0070C0"/>
+          <w:lang/>
+        </w:rPr>
+        <w:t xml:space="preserve">        this.id = id;</w:t>
+      </w:r>
+    </w:p>
+    <w:p>
+      <w:pPr>
+        <w:pStyle w:val="IT245"/>
+        <w:spacing w:before="0" w:line="276" w:lineRule="auto"/>
+        <w:rPr>
+          <w:color w:val="0070C0"/>
+          <w:lang/>
+        </w:rPr>
+      </w:pPr>
+      <w:r>
+        <w:rPr>
+          <w:color w:val="0070C0"/>
+          <w:lang/>
+        </w:rPr>
+        <w:t xml:space="preserve">        this.name = name;</w:t>
+      </w:r>
+    </w:p>
+    <w:p>
+      <w:pPr>
+        <w:pStyle w:val="IT245"/>
+        <w:spacing w:before="0" w:line="276" w:lineRule="auto"/>
+        <w:rPr>
+          <w:color w:val="0070C0"/>
+          <w:lang/>
+        </w:rPr>
+      </w:pPr>
+      <w:r>
+        <w:rPr>
+          <w:color w:val="0070C0"/>
+          <w:lang/>
+        </w:rPr>
+        <w:t xml:space="preserve">        this.priority = priority;</w:t>
+      </w:r>
+    </w:p>
+    <w:p>
+      <w:pPr>
+        <w:pStyle w:val="IT245"/>
+        <w:spacing w:before="0" w:line="276" w:lineRule="auto"/>
+        <w:rPr>
+          <w:color w:val="0070C0"/>
+          <w:lang/>
+        </w:rPr>
+      </w:pPr>
+      <w:r>
+        <w:rPr>
+          <w:color w:val="0070C0"/>
+          <w:lang/>
+        </w:rPr>
+        <w:t xml:space="preserve">        this.arrivalOrder = arrivalOrder;</w:t>
+      </w:r>
+    </w:p>
+    <w:p>
+      <w:pPr>
+        <w:pStyle w:val="IT245"/>
+        <w:spacing w:before="0" w:line="276" w:lineRule="auto"/>
+        <w:rPr>
+          <w:color w:val="0070C0"/>
+          <w:lang/>
+        </w:rPr>
+      </w:pPr>
+      <w:r>
+        <w:rPr>
+          <w:color w:val="0070C0"/>
+          <w:lang/>
+        </w:rPr>
+        <w:t xml:space="preserve">    }</w:t>
+      </w:r>
+    </w:p>
+    <w:p>
+      <w:pPr>
+        <w:pStyle w:val="IT245"/>
+        <w:spacing w:before="0" w:line="276" w:lineRule="auto"/>
+        <w:rPr>
+          <w:color w:val="0070C0"/>
+          <w:lang/>
+        </w:rPr>
+      </w:pPr>
+    </w:p>
+    <w:p>
+      <w:pPr>
+        <w:pStyle w:val="IT245"/>
+        <w:spacing w:before="0" w:line="276" w:lineRule="auto"/>
+        <w:rPr>
+          <w:color w:val="0070C0"/>
+          <w:lang/>
+        </w:rPr>
+      </w:pPr>
+      <w:r>
+        <w:rPr>
+          <w:color w:val="0070C0"/>
+          <w:lang/>
+        </w:rPr>
+        <w:t xml:space="preserve">    public int getPriority() {</w:t>
+      </w:r>
+    </w:p>
+    <w:p>
+      <w:pPr>
+        <w:pStyle w:val="IT245"/>
+        <w:spacing w:before="0" w:line="276" w:lineRule="auto"/>
+        <w:rPr>
+          <w:color w:val="0070C0"/>
+          <w:lang/>
+        </w:rPr>
+      </w:pPr>
+      <w:r>
+        <w:rPr>
+          <w:color w:val="0070C0"/>
+          <w:lang/>
+        </w:rPr>
+        <w:t xml:space="preserve">        return priority;</w:t>
+      </w:r>
+    </w:p>
+    <w:p>
+      <w:pPr>
+        <w:pStyle w:val="IT245"/>
+        <w:spacing w:before="0" w:line="276" w:lineRule="auto"/>
+        <w:rPr>
+          <w:color w:val="0070C0"/>
+          <w:lang/>
+        </w:rPr>
+      </w:pPr>
+      <w:r>
+        <w:rPr>
+          <w:color w:val="0070C0"/>
+          <w:lang/>
+        </w:rPr>
+        <w:t xml:space="preserve">    }</w:t>
+      </w:r>
+    </w:p>
+    <w:p>
+      <w:pPr>
+        <w:pStyle w:val="IT245"/>
+        <w:spacing w:before="0" w:line="276" w:lineRule="auto"/>
+        <w:rPr>
+          <w:color w:val="0070C0"/>
+          <w:lang/>
+        </w:rPr>
+      </w:pPr>
+    </w:p>
+    <w:p>
+      <w:pPr>
+        <w:pStyle w:val="IT245"/>
+        <w:spacing w:before="0" w:line="276" w:lineRule="auto"/>
+        <w:rPr>
+          <w:color w:val="0070C0"/>
+          <w:lang/>
+        </w:rPr>
+      </w:pPr>
+      <w:r>
+        <w:rPr>
+          <w:color w:val="0070C0"/>
+          <w:lang/>
+        </w:rPr>
+        <w:t xml:space="preserve">    public long getArrivalOrder() {</w:t>
+      </w:r>
+    </w:p>
+    <w:p>
+      <w:pPr>
+        <w:pStyle w:val="IT245"/>
+        <w:spacing w:before="0" w:line="276" w:lineRule="auto"/>
+        <w:rPr>
+          <w:color w:val="0070C0"/>
+          <w:lang/>
+        </w:rPr>
+      </w:pPr>
+      <w:r>
+        <w:rPr>
+          <w:color w:val="0070C0"/>
+          <w:lang/>
+        </w:rPr>
+        <w:t xml:space="preserve">        return arrivalOrder;</w:t>
+      </w:r>
+    </w:p>
+    <w:p>
+      <w:pPr>
+        <w:pStyle w:val="IT245"/>
+        <w:spacing w:before="0" w:line="276" w:lineRule="auto"/>
+        <w:rPr>
+          <w:color w:val="0070C0"/>
+          <w:lang/>
+        </w:rPr>
+      </w:pPr>
+      <w:r>
+        <w:rPr>
+          <w:color w:val="0070C0"/>
+          <w:lang/>
+        </w:rPr>
+        <w:t xml:space="preserve">    }</w:t>
+      </w:r>
+    </w:p>
+    <w:p>
+      <w:pPr>
+        <w:pStyle w:val="IT245"/>
+        <w:spacing w:before="0" w:line="276" w:lineRule="auto"/>
+        <w:rPr>
+          <w:color w:val="0070C0"/>
+          <w:lang/>
+        </w:rPr>
+      </w:pPr>
+    </w:p>
+    <w:p>
+      <w:pPr>
+        <w:pStyle w:val="IT245"/>
+        <w:spacing w:before="0" w:line="276" w:lineRule="auto"/>
+        <w:rPr>
+          <w:color w:val="0070C0"/>
+          <w:lang/>
+        </w:rPr>
+      </w:pPr>
+      <w:r>
+        <w:rPr>
+          <w:color w:val="0070C0"/>
+          <w:lang/>
+        </w:rPr>
+        <w:t xml:space="preserve">    @Override</w:t>
+      </w:r>
+    </w:p>
+    <w:p>
+      <w:pPr>
+        <w:pStyle w:val="IT245"/>
+        <w:spacing w:before="0" w:line="276" w:lineRule="auto"/>
+        <w:rPr>
+          <w:color w:val="0070C0"/>
+          <w:lang/>
+        </w:rPr>
+      </w:pPr>
+      <w:r>
+        <w:rPr>
+          <w:color w:val="0070C0"/>
+          <w:lang/>
+        </w:rPr>
+        <w:t xml:space="preserve">    public String toString() {</w:t>
+      </w:r>
+    </w:p>
+    <w:p>
+      <w:pPr>
+        <w:pStyle w:val="IT245"/>
+        <w:spacing w:before="0" w:line="276" w:lineRule="auto"/>
+        <w:rPr>
+          <w:color w:val="0070C0"/>
+          <w:lang/>
+        </w:rPr>
+      </w:pPr>
+      <w:r>
+        <w:rPr>
+          <w:color w:val="0070C0"/>
+          <w:lang/>
+        </w:rPr>
+        <w:t xml:space="preserve">        return "Task ID: " + id</w:t>
+      </w:r>
+    </w:p>
+    <w:p>
+      <w:pPr>
+        <w:pStyle w:val="IT245"/>
+        <w:spacing w:before="0" w:line="276" w:lineRule="auto"/>
+        <w:rPr>
+          <w:color w:val="0070C0"/>
+          <w:lang/>
+        </w:rPr>
+      </w:pPr>
+      <w:r>
+        <w:rPr>
+          <w:color w:val="0070C0"/>
+          <w:lang/>
+        </w:rPr>
+        <w:t xml:space="preserve">                + ", Name: " + name</w:t>
+      </w:r>
+    </w:p>
+    <w:p>
+      <w:pPr>
+        <w:pStyle w:val="IT245"/>
+        <w:spacing w:before="0" w:line="276" w:lineRule="auto"/>
+        <w:rPr>
+          <w:color w:val="0070C0"/>
+          <w:lang/>
+        </w:rPr>
+      </w:pPr>
+      <w:r>
+        <w:rPr>
+          <w:color w:val="0070C0"/>
+          <w:lang/>
+        </w:rPr>
+        <w:t xml:space="preserve">                + ", Priority: " + priority;</w:t>
+      </w:r>
+    </w:p>
+    <w:p>
+      <w:pPr>
+        <w:pStyle w:val="IT245"/>
+        <w:spacing w:before="0" w:line="276" w:lineRule="auto"/>
+        <w:rPr>
+          <w:color w:val="0070C0"/>
+          <w:lang/>
+        </w:rPr>
+      </w:pPr>
+      <w:r>
+        <w:rPr>
+          <w:color w:val="0070C0"/>
+          <w:lang/>
+        </w:rPr>
+        <w:t xml:space="preserve">    }</w:t>
+      </w:r>
+    </w:p>
+    <w:p>
+      <w:pPr>
+        <w:pStyle w:val="IT245"/>
+        <w:spacing w:before="0" w:line="276" w:lineRule="auto"/>
+        <w:rPr>
+          <w:color w:val="0070C0"/>
+          <w:lang/>
+        </w:rPr>
+      </w:pPr>
+      <w:r>
+        <w:rPr>
+          <w:color w:val="0070C0"/>
+          <w:lang/>
+        </w:rPr>
+        <w:t>}</w:t>
+      </w:r>
+    </w:p>
+    <w:p>
+      <w:pPr>
+        <w:pStyle w:val="IT245"/>
+        <w:rPr>
+          <w:b/>
+          <w:lang/>
+        </w:rPr>
+      </w:pPr>
+      <w:r>
+        <w:rPr>
+          <w:b/>
+          <w:lang/>
+        </w:rPr>
+        <w:t>5.2 ArrayList Task Scheduler</w:t>
+      </w:r>
+    </w:p>
+    <w:p>
+      <w:pPr>
+        <w:pStyle w:val="IT245"/>
+        <w:rPr>
+          <w:lang/>
+        </w:rPr>
+      </w:pPr>
+      <w:r>
+        <w:rPr>
+          <w:lang/>
+        </w:rPr>
+        <w:lastRenderedPageBreak/>
+        <w:t>The first implementation uses an ArrayList. Each new task is inserted into its correct position according to priority and arrival order. A smaller priority value indicates a more urgent task.</w:t>
+      </w:r>
+    </w:p>
+    <w:p>
+      <w:pPr>
+        <w:pStyle w:val="IT245"/>
+        <w:spacing w:before="0" w:line="276" w:lineRule="auto"/>
+        <w:rPr>
+          <w:color w:val="0070C0"/>
+          <w:lang/>
+        </w:rPr>
+      </w:pPr>
+      <w:r>
+        <w:rPr>
+          <w:color w:val="0070C0"/>
+          <w:lang/>
+        </w:rPr>
+        <w:t>import java.util.ArrayList;</w:t>
+      </w:r>
+    </w:p>
+    <w:p>
+      <w:pPr>
+        <w:pStyle w:val="IT245"/>
+        <w:spacing w:before="0" w:line="276" w:lineRule="auto"/>
+        <w:rPr>
+          <w:color w:val="0070C0"/>
+          <w:lang/>
+        </w:rPr>
+      </w:pPr>
+    </w:p>
+    <w:p>
+      <w:pPr>
+        <w:pStyle w:val="IT245"/>
+        <w:spacing w:before="0" w:line="276" w:lineRule="auto"/>
+        <w:rPr>
+          <w:color w:val="0070C0"/>
+          <w:lang/>
+        </w:rPr>
+      </w:pPr>
+      <w:r>
+        <w:rPr>
+          <w:color w:val="0070C0"/>
+          <w:lang/>
+        </w:rPr>
+        <w:t>public class ArrayListTaskScheduler {</w:t>
+      </w:r>
+    </w:p>
+    <w:p>
+      <w:pPr>
+        <w:pStyle w:val="IT245"/>
+        <w:spacing w:before="0" w:line="276" w:lineRule="auto"/>
+        <w:rPr>
+          <w:color w:val="0070C0"/>
+          <w:lang/>
+        </w:rPr>
+      </w:pPr>
+      <w:r>
+        <w:rPr>
+          <w:color w:val="0070C0"/>
+          <w:lang/>
+        </w:rPr>
+        <w:t xml:space="preserve">    private ArrayList&lt;Task&gt; tasks;</w:t>
+      </w:r>
+    </w:p>
+    <w:p>
+      <w:pPr>
+        <w:pStyle w:val="IT245"/>
+        <w:spacing w:before="0" w:line="276" w:lineRule="auto"/>
+        <w:rPr>
+          <w:color w:val="0070C0"/>
+          <w:lang/>
+        </w:rPr>
+      </w:pPr>
+      <w:r>
+        <w:rPr>
+          <w:color w:val="0070C0"/>
+          <w:lang/>
+        </w:rPr>
+        <w:t xml:space="preserve">    private long sequence;</w:t>
+      </w:r>
+    </w:p>
+    <w:p>
+      <w:pPr>
+        <w:pStyle w:val="IT245"/>
+        <w:spacing w:before="0" w:line="276" w:lineRule="auto"/>
+        <w:rPr>
+          <w:color w:val="0070C0"/>
+          <w:lang/>
+        </w:rPr>
+      </w:pPr>
+    </w:p>
+    <w:p>
+      <w:pPr>
+        <w:pStyle w:val="IT245"/>
+        <w:spacing w:before="0" w:line="276" w:lineRule="auto"/>
+        <w:rPr>
+          <w:color w:val="0070C0"/>
+          <w:lang/>
+        </w:rPr>
+      </w:pPr>
+      <w:r>
+        <w:rPr>
+          <w:color w:val="0070C0"/>
+          <w:lang/>
+        </w:rPr>
+        <w:t xml:space="preserve">    public ArrayListTaskScheduler() {</w:t>
+      </w:r>
+    </w:p>
+    <w:p>
+      <w:pPr>
+        <w:pStyle w:val="IT245"/>
+        <w:spacing w:before="0" w:line="276" w:lineRule="auto"/>
+        <w:rPr>
+          <w:color w:val="0070C0"/>
+          <w:lang/>
+        </w:rPr>
+      </w:pPr>
+      <w:r>
+        <w:rPr>
+          <w:color w:val="0070C0"/>
+          <w:lang/>
+        </w:rPr>
+        <w:t xml:space="preserve">        tasks = new ArrayList&lt;&gt;();</w:t>
+      </w:r>
+    </w:p>
+    <w:p>
+      <w:pPr>
+        <w:pStyle w:val="IT245"/>
+        <w:spacing w:before="0" w:line="276" w:lineRule="auto"/>
+        <w:rPr>
+          <w:color w:val="0070C0"/>
+          <w:lang/>
+        </w:rPr>
+      </w:pPr>
+      <w:r>
+        <w:rPr>
+          <w:color w:val="0070C0"/>
+          <w:lang/>
+        </w:rPr>
+        <w:t xml:space="preserve">        sequence = 0;</w:t>
+      </w:r>
+    </w:p>
+    <w:p>
+      <w:pPr>
+        <w:pStyle w:val="IT245"/>
+        <w:spacing w:before="0" w:line="276" w:lineRule="auto"/>
+        <w:rPr>
+          <w:color w:val="0070C0"/>
+          <w:lang/>
+        </w:rPr>
+      </w:pPr>
+      <w:r>
+        <w:rPr>
+          <w:color w:val="0070C0"/>
+          <w:lang/>
+        </w:rPr>
+        <w:t xml:space="preserve">    }</w:t>
+      </w:r>
+    </w:p>
+    <w:p>
+      <w:pPr>
+        <w:pStyle w:val="IT245"/>
+        <w:spacing w:before="0" w:line="276" w:lineRule="auto"/>
+        <w:rPr>
+          <w:color w:val="0070C0"/>
+          <w:lang/>
+        </w:rPr>
+      </w:pPr>
+    </w:p>
+    <w:p>
+      <w:pPr>
+        <w:pStyle w:val="IT245"/>
+        <w:spacing w:before="0" w:line="276" w:lineRule="auto"/>
+        <w:rPr>
+          <w:color w:val="0070C0"/>
+          <w:lang/>
+        </w:rPr>
+      </w:pPr>
+      <w:r>
+        <w:rPr>
+          <w:color w:val="0070C0"/>
+          <w:lang/>
+        </w:rPr>
+        <w:t xml:space="preserve">    public void addTask(int id, String name, int priority) {</w:t>
+      </w:r>
+    </w:p>
+    <w:p>
+      <w:pPr>
+        <w:pStyle w:val="IT245"/>
+        <w:spacing w:before="0" w:line="276" w:lineRule="auto"/>
+        <w:rPr>
+          <w:color w:val="0070C0"/>
+          <w:lang/>
+        </w:rPr>
+      </w:pPr>
+      <w:r>
+        <w:rPr>
+          <w:color w:val="0070C0"/>
+          <w:lang/>
+        </w:rPr>
+        <w:t xml:space="preserve">        if (name == null || name.trim().isEmpty()) {</w:t>
+      </w:r>
+    </w:p>
+    <w:p>
+      <w:pPr>
+        <w:pStyle w:val="IT245"/>
+        <w:spacing w:before="0" w:line="276" w:lineRule="auto"/>
+        <w:rPr>
+          <w:color w:val="0070C0"/>
+          <w:lang/>
+        </w:rPr>
+      </w:pPr>
+      <w:r>
+        <w:rPr>
+          <w:color w:val="0070C0"/>
+          <w:lang/>
+        </w:rPr>
+        <w:t xml:space="preserve">            System.out.println("Task name cannot be empty.");</w:t>
+      </w:r>
+    </w:p>
+    <w:p>
+      <w:pPr>
+        <w:pStyle w:val="IT245"/>
+        <w:spacing w:before="0" w:line="276" w:lineRule="auto"/>
+        <w:rPr>
+          <w:color w:val="0070C0"/>
+          <w:lang/>
+        </w:rPr>
+      </w:pPr>
+      <w:r>
+        <w:rPr>
+          <w:color w:val="0070C0"/>
+          <w:lang/>
+        </w:rPr>
+        <w:t xml:space="preserve">            return;</w:t>
+      </w:r>
+    </w:p>
+    <w:p>
+      <w:pPr>
+        <w:pStyle w:val="IT245"/>
+        <w:spacing w:before="0" w:line="276" w:lineRule="auto"/>
+        <w:rPr>
+          <w:color w:val="0070C0"/>
+          <w:lang/>
+        </w:rPr>
+      </w:pPr>
+      <w:r>
+        <w:rPr>
+          <w:color w:val="0070C0"/>
+          <w:lang/>
+        </w:rPr>
+        <w:t xml:space="preserve">        }</w:t>
+      </w:r>
+    </w:p>
+    <w:p>
+      <w:pPr>
+        <w:pStyle w:val="IT245"/>
+        <w:spacing w:before="0" w:line="276" w:lineRule="auto"/>
+        <w:rPr>
+          <w:color w:val="0070C0"/>
+          <w:lang/>
+        </w:rPr>
+      </w:pPr>
+    </w:p>
+    <w:p>
+      <w:pPr>
+        <w:pStyle w:val="IT245"/>
+        <w:spacing w:before="0" w:line="276" w:lineRule="auto"/>
+        <w:rPr>
+          <w:color w:val="0070C0"/>
+          <w:lang/>
+        </w:rPr>
+      </w:pPr>
+      <w:r>
+        <w:rPr>
+          <w:color w:val="0070C0"/>
+          <w:lang/>
+        </w:rPr>
+        <w:t xml:space="preserve">        if (priority &lt; 1) {</w:t>
+      </w:r>
+    </w:p>
+    <w:p>
+      <w:pPr>
+        <w:pStyle w:val="IT245"/>
+        <w:spacing w:before="0" w:line="276" w:lineRule="auto"/>
+        <w:rPr>
+          <w:color w:val="0070C0"/>
+          <w:lang/>
+        </w:rPr>
+      </w:pPr>
+      <w:r>
+        <w:rPr>
+          <w:color w:val="0070C0"/>
+          <w:lang/>
+        </w:rPr>
+        <w:t xml:space="preserve">            System.out.println("Priority must be 1 or greater.");</w:t>
+      </w:r>
+    </w:p>
+    <w:p>
+      <w:pPr>
+        <w:pStyle w:val="IT245"/>
+        <w:spacing w:before="0" w:line="276" w:lineRule="auto"/>
+        <w:rPr>
+          <w:color w:val="0070C0"/>
+          <w:lang/>
+        </w:rPr>
+      </w:pPr>
+      <w:r>
+        <w:rPr>
+          <w:color w:val="0070C0"/>
+          <w:lang/>
+        </w:rPr>
+        <w:t xml:space="preserve">            return;</w:t>
+      </w:r>
+    </w:p>
+    <w:p>
+      <w:pPr>
+        <w:pStyle w:val="IT245"/>
+        <w:spacing w:before="0" w:line="276" w:lineRule="auto"/>
+        <w:rPr>
+          <w:color w:val="0070C0"/>
+          <w:lang/>
+        </w:rPr>
+      </w:pPr>
+      <w:r>
+        <w:rPr>
+          <w:color w:val="0070C0"/>
+          <w:lang/>
+        </w:rPr>
+        <w:t xml:space="preserve">        }</w:t>
+      </w:r>
+    </w:p>
+    <w:p>
+      <w:pPr>
+        <w:pStyle w:val="IT245"/>
+        <w:spacing w:before="0" w:line="276" w:lineRule="auto"/>
+        <w:rPr>
+          <w:color w:val="0070C0"/>
+          <w:lang/>
+        </w:rPr>
+      </w:pPr>
+    </w:p>
+    <w:p>
+      <w:pPr>
+        <w:pStyle w:val="IT245"/>
+        <w:spacing w:before="0" w:line="276" w:lineRule="auto"/>
+        <w:rPr>
+          <w:color w:val="0070C0"/>
+          <w:lang/>
+        </w:rPr>
+      </w:pPr>
+      <w:r>
+        <w:rPr>
+          <w:color w:val="0070C0"/>
+          <w:lang/>
+        </w:rPr>
+        <w:t xml:space="preserve">        Task newTask = new Task(id, name, priority, sequence++);</w:t>
+      </w:r>
+    </w:p>
+    <w:p>
+      <w:pPr>
+        <w:pStyle w:val="IT245"/>
+        <w:spacing w:before="0" w:line="276" w:lineRule="auto"/>
+        <w:rPr>
+          <w:color w:val="0070C0"/>
+          <w:lang/>
+        </w:rPr>
+      </w:pPr>
+      <w:r>
+        <w:rPr>
+          <w:color w:val="0070C0"/>
+          <w:lang/>
+        </w:rPr>
+        <w:t xml:space="preserve">        int position = 0;</w:t>
+      </w:r>
+    </w:p>
+    <w:p>
+      <w:pPr>
+        <w:pStyle w:val="IT245"/>
+        <w:spacing w:before="0" w:line="276" w:lineRule="auto"/>
+        <w:rPr>
+          <w:color w:val="0070C0"/>
+          <w:lang/>
+        </w:rPr>
+      </w:pPr>
+    </w:p>
+    <w:p>
+      <w:pPr>
+        <w:pStyle w:val="IT245"/>
+        <w:spacing w:before="0" w:line="276" w:lineRule="auto"/>
+        <w:rPr>
+          <w:color w:val="0070C0"/>
+          <w:lang/>
+        </w:rPr>
+      </w:pPr>
+      <w:r>
+        <w:rPr>
+          <w:color w:val="0070C0"/>
+          <w:lang/>
+        </w:rPr>
+        <w:t xml:space="preserve">        while (position &lt; tasks.size()) {</w:t>
+      </w:r>
+    </w:p>
+    <w:p>
+      <w:pPr>
+        <w:pStyle w:val="IT245"/>
+        <w:spacing w:before="0" w:line="276" w:lineRule="auto"/>
+        <w:rPr>
+          <w:color w:val="0070C0"/>
+          <w:lang/>
+        </w:rPr>
+      </w:pPr>
+      <w:r>
+        <w:rPr>
+          <w:color w:val="0070C0"/>
+          <w:lang/>
+        </w:rPr>
+        <w:t xml:space="preserve">            Task currentTask = tasks.get(position);</w:t>
+      </w:r>
+    </w:p>
+    <w:p>
+      <w:pPr>
+        <w:pStyle w:val="IT245"/>
+        <w:spacing w:before="0" w:line="276" w:lineRule="auto"/>
+        <w:rPr>
+          <w:color w:val="0070C0"/>
+          <w:lang/>
+        </w:rPr>
+      </w:pPr>
+    </w:p>
+    <w:p>
+      <w:pPr>
+        <w:pStyle w:val="IT245"/>
+        <w:spacing w:before="0" w:line="276" w:lineRule="auto"/>
+        <w:rPr>
+          <w:color w:val="0070C0"/>
+          <w:lang/>
+        </w:rPr>
+      </w:pPr>
+      <w:r>
+        <w:rPr>
+          <w:color w:val="0070C0"/>
+          <w:lang/>
+        </w:rPr>
+        <w:t xml:space="preserve">            if (newTask.getPriority()</w:t>
+      </w:r>
+    </w:p>
+    <w:p>
+      <w:pPr>
+        <w:pStyle w:val="IT245"/>
+        <w:spacing w:before="0" w:line="276" w:lineRule="auto"/>
+        <w:rPr>
+          <w:color w:val="0070C0"/>
+          <w:lang/>
+        </w:rPr>
+      </w:pPr>
+      <w:r>
+        <w:rPr>
+          <w:color w:val="0070C0"/>
+          <w:lang/>
+        </w:rPr>
+        <w:t xml:space="preserve">                    &lt; currentTask.getPriority()) {</w:t>
+      </w:r>
+    </w:p>
+    <w:p>
+      <w:pPr>
+        <w:pStyle w:val="IT245"/>
+        <w:spacing w:before="0" w:line="276" w:lineRule="auto"/>
+        <w:rPr>
+          <w:color w:val="0070C0"/>
+          <w:lang/>
+        </w:rPr>
+      </w:pPr>
+      <w:r>
+        <w:rPr>
+          <w:color w:val="0070C0"/>
+          <w:lang/>
+        </w:rPr>
+        <w:t xml:space="preserve">                break;</w:t>
+      </w:r>
+    </w:p>
+    <w:p>
+      <w:pPr>
+        <w:pStyle w:val="IT245"/>
+        <w:spacing w:before="0" w:line="276" w:lineRule="auto"/>
+        <w:rPr>
+          <w:color w:val="0070C0"/>
+          <w:lang/>
+        </w:rPr>
+      </w:pPr>
+      <w:r>
+        <w:rPr>
+          <w:color w:val="0070C0"/>
+          <w:lang/>
+        </w:rPr>
+        <w:lastRenderedPageBreak/>
+        <w:t xml:space="preserve">            }</w:t>
+      </w:r>
+    </w:p>
+    <w:p>
+      <w:pPr>
+        <w:pStyle w:val="IT245"/>
+        <w:spacing w:before="0" w:line="276" w:lineRule="auto"/>
+        <w:rPr>
+          <w:color w:val="0070C0"/>
+          <w:lang/>
+        </w:rPr>
+      </w:pPr>
+    </w:p>
+    <w:p>
+      <w:pPr>
+        <w:pStyle w:val="IT245"/>
+        <w:spacing w:before="0" w:line="276" w:lineRule="auto"/>
+        <w:rPr>
+          <w:color w:val="0070C0"/>
+          <w:lang/>
+        </w:rPr>
+      </w:pPr>
+      <w:r>
+        <w:rPr>
+          <w:color w:val="0070C0"/>
+          <w:lang/>
+        </w:rPr>
+        <w:t xml:space="preserve">            if (newTask.getPriority()</w:t>
+      </w:r>
+    </w:p>
+    <w:p>
+      <w:pPr>
+        <w:pStyle w:val="IT245"/>
+        <w:spacing w:before="0" w:line="276" w:lineRule="auto"/>
+        <w:rPr>
+          <w:color w:val="0070C0"/>
+          <w:lang/>
+        </w:rPr>
+      </w:pPr>
+      <w:r>
+        <w:rPr>
+          <w:color w:val="0070C0"/>
+          <w:lang/>
+        </w:rPr>
+        <w:t xml:space="preserve">                    == currentTask.getPriority()</w:t>
+      </w:r>
+    </w:p>
+    <w:p>
+      <w:pPr>
+        <w:pStyle w:val="IT245"/>
+        <w:spacing w:before="0" w:line="276" w:lineRule="auto"/>
+        <w:rPr>
+          <w:color w:val="0070C0"/>
+          <w:lang/>
+        </w:rPr>
+      </w:pPr>
+      <w:r>
+        <w:rPr>
+          <w:color w:val="0070C0"/>
+          <w:lang/>
+        </w:rPr>
+        <w:t xml:space="preserve">                    &amp;&amp; newTask.getArrivalOrder()</w:t>
+      </w:r>
+    </w:p>
+    <w:p>
+      <w:pPr>
+        <w:pStyle w:val="IT245"/>
+        <w:spacing w:before="0" w:line="276" w:lineRule="auto"/>
+        <w:rPr>
+          <w:color w:val="0070C0"/>
+          <w:lang/>
+        </w:rPr>
+      </w:pPr>
+      <w:r>
+        <w:rPr>
+          <w:color w:val="0070C0"/>
+          <w:lang/>
+        </w:rPr>
+        <w:t xml:space="preserve">                    &lt; currentTask.getArrivalOrder()) {</w:t>
+      </w:r>
+    </w:p>
+    <w:p>
+      <w:pPr>
+        <w:pStyle w:val="IT245"/>
+        <w:spacing w:before="0" w:line="276" w:lineRule="auto"/>
+        <w:rPr>
+          <w:color w:val="0070C0"/>
+          <w:lang/>
+        </w:rPr>
+      </w:pPr>
+      <w:r>
+        <w:rPr>
+          <w:color w:val="0070C0"/>
+          <w:lang/>
+        </w:rPr>
+        <w:t xml:space="preserve">                break;</w:t>
+      </w:r>
+    </w:p>
+    <w:p>
+      <w:pPr>
+        <w:pStyle w:val="IT245"/>
+        <w:spacing w:before="0" w:line="276" w:lineRule="auto"/>
+        <w:rPr>
+          <w:color w:val="0070C0"/>
+          <w:lang/>
+        </w:rPr>
+      </w:pPr>
+      <w:r>
+        <w:rPr>
+          <w:color w:val="0070C0"/>
+          <w:lang/>
+        </w:rPr>
+        <w:t xml:space="preserve">            }</w:t>
+      </w:r>
+    </w:p>
+    <w:p>
+      <w:pPr>
+        <w:pStyle w:val="IT245"/>
+        <w:spacing w:before="0" w:line="276" w:lineRule="auto"/>
+        <w:rPr>
+          <w:color w:val="0070C0"/>
+          <w:lang/>
+        </w:rPr>
+      </w:pPr>
+    </w:p>
+    <w:p>
+      <w:pPr>
+        <w:pStyle w:val="IT245"/>
+        <w:spacing w:before="0" w:line="276" w:lineRule="auto"/>
+        <w:rPr>
+          <w:color w:val="0070C0"/>
+          <w:lang/>
+        </w:rPr>
+      </w:pPr>
+      <w:r>
+        <w:rPr>
+          <w:color w:val="0070C0"/>
+          <w:lang/>
+        </w:rPr>
+        <w:t xml:space="preserve">            position++;</w:t>
+      </w:r>
+    </w:p>
+    <w:p>
+      <w:pPr>
+        <w:pStyle w:val="IT245"/>
+        <w:spacing w:before="0" w:line="276" w:lineRule="auto"/>
+        <w:rPr>
+          <w:color w:val="0070C0"/>
+          <w:lang/>
+        </w:rPr>
+      </w:pPr>
+      <w:r>
+        <w:rPr>
+          <w:color w:val="0070C0"/>
+          <w:lang/>
+        </w:rPr>
+        <w:t xml:space="preserve">        }</w:t>
+      </w:r>
+    </w:p>
+    <w:p>
+      <w:pPr>
+        <w:pStyle w:val="IT245"/>
+        <w:spacing w:before="0" w:line="276" w:lineRule="auto"/>
+        <w:rPr>
+          <w:color w:val="0070C0"/>
+          <w:lang/>
+        </w:rPr>
+      </w:pPr>
+    </w:p>
+    <w:p>
+      <w:pPr>
+        <w:pStyle w:val="IT245"/>
+        <w:spacing w:before="0" w:line="276" w:lineRule="auto"/>
+        <w:rPr>
+          <w:color w:val="0070C0"/>
+          <w:lang/>
+        </w:rPr>
+      </w:pPr>
+      <w:r>
+        <w:rPr>
+          <w:color w:val="0070C0"/>
+          <w:lang/>
+        </w:rPr>
+        <w:t xml:space="preserve">        tasks.add(position, newTask);</w:t>
+      </w:r>
+    </w:p>
+    <w:p>
+      <w:pPr>
+        <w:pStyle w:val="IT245"/>
+        <w:spacing w:before="0" w:line="276" w:lineRule="auto"/>
+        <w:rPr>
+          <w:color w:val="0070C0"/>
+          <w:lang/>
+        </w:rPr>
+      </w:pPr>
+      <w:r>
+        <w:rPr>
+          <w:color w:val="0070C0"/>
+          <w:lang/>
+        </w:rPr>
+        <w:t xml:space="preserve">    }</w:t>
+      </w:r>
+    </w:p>
+    <w:p>
+      <w:pPr>
+        <w:pStyle w:val="IT245"/>
+        <w:spacing w:before="0" w:line="276" w:lineRule="auto"/>
+        <w:rPr>
+          <w:color w:val="0070C0"/>
+          <w:lang/>
+        </w:rPr>
+      </w:pPr>
+    </w:p>
+    <w:p>
+      <w:pPr>
+        <w:pStyle w:val="IT245"/>
+        <w:spacing w:before="0" w:line="276" w:lineRule="auto"/>
+        <w:rPr>
+          <w:color w:val="0070C0"/>
+          <w:lang/>
+        </w:rPr>
+      </w:pPr>
+      <w:r>
+        <w:rPr>
+          <w:color w:val="0070C0"/>
+          <w:lang/>
+        </w:rPr>
+        <w:t xml:space="preserve">    public Task viewNextTask() {</w:t>
+      </w:r>
+    </w:p>
+    <w:p>
+      <w:pPr>
+        <w:pStyle w:val="IT245"/>
+        <w:spacing w:before="0" w:line="276" w:lineRule="auto"/>
+        <w:rPr>
+          <w:color w:val="0070C0"/>
+          <w:lang/>
+        </w:rPr>
+      </w:pPr>
+      <w:r>
+        <w:rPr>
+          <w:color w:val="0070C0"/>
+          <w:lang/>
+        </w:rPr>
+        <w:t xml:space="preserve">        if (tasks.isEmpty()) {</w:t>
+      </w:r>
+    </w:p>
+    <w:p>
+      <w:pPr>
+        <w:pStyle w:val="IT245"/>
+        <w:spacing w:before="0" w:line="276" w:lineRule="auto"/>
+        <w:rPr>
+          <w:color w:val="0070C0"/>
+          <w:lang/>
+        </w:rPr>
+      </w:pPr>
+      <w:r>
+        <w:rPr>
+          <w:color w:val="0070C0"/>
+          <w:lang/>
+        </w:rPr>
+        <w:t xml:space="preserve">            return null;</w:t>
+      </w:r>
+    </w:p>
+    <w:p>
+      <w:pPr>
+        <w:pStyle w:val="IT245"/>
+        <w:spacing w:before="0" w:line="276" w:lineRule="auto"/>
+        <w:rPr>
+          <w:color w:val="0070C0"/>
+          <w:lang/>
+        </w:rPr>
+      </w:pPr>
+      <w:r>
+        <w:rPr>
+          <w:color w:val="0070C0"/>
+          <w:lang/>
+        </w:rPr>
+        <w:t xml:space="preserve">        }</w:t>
+      </w:r>
+    </w:p>
+    <w:p>
+      <w:pPr>
+        <w:pStyle w:val="IT245"/>
+        <w:spacing w:before="0" w:line="276" w:lineRule="auto"/>
+        <w:rPr>
+          <w:color w:val="0070C0"/>
+          <w:lang/>
+        </w:rPr>
+      </w:pPr>
+    </w:p>
+    <w:p>
+      <w:pPr>
+        <w:pStyle w:val="IT245"/>
+        <w:spacing w:before="0" w:line="276" w:lineRule="auto"/>
+        <w:rPr>
+          <w:color w:val="0070C0"/>
+          <w:lang/>
+        </w:rPr>
+      </w:pPr>
+      <w:r>
+        <w:rPr>
+          <w:color w:val="0070C0"/>
+          <w:lang/>
+        </w:rPr>
+        <w:t xml:space="preserve">        return tasks.get(0);</w:t>
+      </w:r>
+    </w:p>
+    <w:p>
+      <w:pPr>
+        <w:pStyle w:val="IT245"/>
+        <w:spacing w:before="0" w:line="276" w:lineRule="auto"/>
+        <w:rPr>
+          <w:color w:val="0070C0"/>
+          <w:lang/>
+        </w:rPr>
+      </w:pPr>
+      <w:r>
+        <w:rPr>
+          <w:color w:val="0070C0"/>
+          <w:lang/>
+        </w:rPr>
+        <w:t xml:space="preserve">    }</w:t>
+      </w:r>
+    </w:p>
+    <w:p>
+      <w:pPr>
+        <w:pStyle w:val="IT245"/>
+        <w:spacing w:before="0" w:line="276" w:lineRule="auto"/>
+        <w:rPr>
+          <w:color w:val="0070C0"/>
+          <w:lang/>
+        </w:rPr>
+      </w:pPr>
+    </w:p>
+    <w:p>
+      <w:pPr>
+        <w:pStyle w:val="IT245"/>
+        <w:spacing w:before="0" w:line="276" w:lineRule="auto"/>
+        <w:rPr>
+          <w:color w:val="0070C0"/>
+          <w:lang/>
+        </w:rPr>
+      </w:pPr>
+      <w:r>
+        <w:rPr>
+          <w:color w:val="0070C0"/>
+          <w:lang/>
+        </w:rPr>
+        <w:t xml:space="preserve">    public Task processNextTask() {</w:t>
+      </w:r>
+    </w:p>
+    <w:p>
+      <w:pPr>
+        <w:pStyle w:val="IT245"/>
+        <w:spacing w:before="0" w:line="276" w:lineRule="auto"/>
+        <w:rPr>
+          <w:color w:val="0070C0"/>
+          <w:lang/>
+        </w:rPr>
+      </w:pPr>
+      <w:r>
+        <w:rPr>
+          <w:color w:val="0070C0"/>
+          <w:lang/>
+        </w:rPr>
+        <w:t xml:space="preserve">        if (tasks.isEmpty()) {</w:t>
+      </w:r>
+    </w:p>
+    <w:p>
+      <w:pPr>
+        <w:pStyle w:val="IT245"/>
+        <w:spacing w:before="0" w:line="276" w:lineRule="auto"/>
+        <w:rPr>
+          <w:color w:val="0070C0"/>
+          <w:lang/>
+        </w:rPr>
+      </w:pPr>
+      <w:r>
+        <w:rPr>
+          <w:color w:val="0070C0"/>
+          <w:lang/>
+        </w:rPr>
+        <w:t xml:space="preserve">            return null;</w:t>
+      </w:r>
+    </w:p>
+    <w:p>
+      <w:pPr>
+        <w:pStyle w:val="IT245"/>
+        <w:spacing w:before="0" w:line="276" w:lineRule="auto"/>
+        <w:rPr>
+          <w:color w:val="0070C0"/>
+          <w:lang/>
+        </w:rPr>
+      </w:pPr>
+      <w:r>
+        <w:rPr>
+          <w:color w:val="0070C0"/>
+          <w:lang/>
+        </w:rPr>
+        <w:t xml:space="preserve">        }</w:t>
+      </w:r>
+    </w:p>
+    <w:p>
+      <w:pPr>
+        <w:pStyle w:val="IT245"/>
+        <w:spacing w:before="0" w:line="276" w:lineRule="auto"/>
+        <w:rPr>
+          <w:color w:val="0070C0"/>
+          <w:lang/>
+        </w:rPr>
+      </w:pPr>
+    </w:p>
+    <w:p>
+      <w:pPr>
+        <w:pStyle w:val="IT245"/>
+        <w:spacing w:before="0" w:line="276" w:lineRule="auto"/>
+        <w:rPr>
+          <w:color w:val="0070C0"/>
+          <w:lang/>
+        </w:rPr>
+      </w:pPr>
+      <w:r>
+        <w:rPr>
+          <w:color w:val="0070C0"/>
+          <w:lang/>
+        </w:rPr>
+        <w:t xml:space="preserve">        return tasks.remove(0);</w:t>
+      </w:r>
+    </w:p>
+    <w:p>
+      <w:pPr>
+        <w:pStyle w:val="IT245"/>
+        <w:spacing w:before="0" w:line="276" w:lineRule="auto"/>
+        <w:rPr>
+          <w:color w:val="0070C0"/>
+          <w:lang/>
+        </w:rPr>
+      </w:pPr>
+      <w:r>
+        <w:rPr>
+          <w:color w:val="0070C0"/>
+          <w:lang/>
+        </w:rPr>
+        <w:t xml:space="preserve">    }</w:t>
+      </w:r>
+    </w:p>
+    <w:p>
+      <w:pPr>
+        <w:pStyle w:val="IT245"/>
+        <w:spacing w:before="0" w:line="276" w:lineRule="auto"/>
+        <w:rPr>
+          <w:color w:val="0070C0"/>
+          <w:lang/>
+        </w:rPr>
+      </w:pPr>
+    </w:p>
+    <w:p>
+      <w:pPr>
+        <w:pStyle w:val="IT245"/>
+        <w:spacing w:before="0" w:line="276" w:lineRule="auto"/>
+        <w:rPr>
+          <w:color w:val="0070C0"/>
+          <w:lang/>
+        </w:rPr>
+      </w:pPr>
+      <w:r>
+        <w:rPr>
+          <w:color w:val="0070C0"/>
+          <w:lang/>
+        </w:rPr>
+        <w:t xml:space="preserve">    public void displayTasks() {</w:t>
+      </w:r>
+    </w:p>
+    <w:p>
+      <w:pPr>
+        <w:pStyle w:val="IT245"/>
+        <w:spacing w:before="0" w:line="276" w:lineRule="auto"/>
+        <w:rPr>
+          <w:color w:val="0070C0"/>
+          <w:lang/>
+        </w:rPr>
+      </w:pPr>
+      <w:r>
+        <w:rPr>
+          <w:color w:val="0070C0"/>
+          <w:lang/>
+        </w:rPr>
+        <w:t xml:space="preserve">        if (tasks.isEmpty()) {</w:t>
+      </w:r>
+    </w:p>
+    <w:p>
+      <w:pPr>
+        <w:pStyle w:val="IT245"/>
+        <w:spacing w:before="0" w:line="276" w:lineRule="auto"/>
+        <w:rPr>
+          <w:color w:val="0070C0"/>
+          <w:lang/>
+        </w:rPr>
+      </w:pPr>
+      <w:r>
+        <w:rPr>
+          <w:color w:val="0070C0"/>
+          <w:lang/>
+        </w:rPr>
+        <w:t xml:space="preserve">            System.out.println("No pending tasks.");</w:t>
+      </w:r>
+    </w:p>
+    <w:p>
+      <w:pPr>
+        <w:pStyle w:val="IT245"/>
+        <w:spacing w:before="0" w:line="276" w:lineRule="auto"/>
+        <w:rPr>
+          <w:color w:val="0070C0"/>
+          <w:lang/>
+        </w:rPr>
+      </w:pPr>
+      <w:r>
+        <w:rPr>
+          <w:color w:val="0070C0"/>
+          <w:lang/>
+        </w:rPr>
+        <w:t xml:space="preserve">            return;</w:t>
+      </w:r>
+    </w:p>
+    <w:p>
+      <w:pPr>
+        <w:pStyle w:val="IT245"/>
+        <w:spacing w:before="0" w:line="276" w:lineRule="auto"/>
+        <w:rPr>
+          <w:color w:val="0070C0"/>
+          <w:lang/>
+        </w:rPr>
+      </w:pPr>
+      <w:r>
+        <w:rPr>
+          <w:color w:val="0070C0"/>
+          <w:lang/>
+        </w:rPr>
+        <w:lastRenderedPageBreak/>
+        <w:t xml:space="preserve">        }</w:t>
+      </w:r>
+    </w:p>
+    <w:p>
+      <w:pPr>
+        <w:pStyle w:val="IT245"/>
+        <w:spacing w:before="0" w:line="276" w:lineRule="auto"/>
+        <w:rPr>
+          <w:color w:val="0070C0"/>
+          <w:lang/>
+        </w:rPr>
+      </w:pPr>
+    </w:p>
+    <w:p>
+      <w:pPr>
+        <w:pStyle w:val="IT245"/>
+        <w:spacing w:before="0" w:line="276" w:lineRule="auto"/>
+        <w:rPr>
+          <w:color w:val="0070C0"/>
+          <w:lang/>
+        </w:rPr>
+      </w:pPr>
+      <w:r>
+        <w:rPr>
+          <w:color w:val="0070C0"/>
+          <w:lang/>
+        </w:rPr>
+        <w:t xml:space="preserve">        for (Task task : tasks) {</w:t>
+      </w:r>
+    </w:p>
+    <w:p>
+      <w:pPr>
+        <w:pStyle w:val="IT245"/>
+        <w:spacing w:before="0" w:line="276" w:lineRule="auto"/>
+        <w:rPr>
+          <w:color w:val="0070C0"/>
+          <w:lang/>
+        </w:rPr>
+      </w:pPr>
+      <w:r>
+        <w:rPr>
+          <w:color w:val="0070C0"/>
+          <w:lang/>
+        </w:rPr>
+        <w:t xml:space="preserve">            System.out.println(task);</w:t>
+      </w:r>
+    </w:p>
+    <w:p>
+      <w:pPr>
+        <w:pStyle w:val="IT245"/>
+        <w:spacing w:before="0" w:line="276" w:lineRule="auto"/>
+        <w:rPr>
+          <w:color w:val="0070C0"/>
+          <w:lang/>
+        </w:rPr>
+      </w:pPr>
+      <w:r>
+        <w:rPr>
+          <w:color w:val="0070C0"/>
+          <w:lang/>
+        </w:rPr>
+        <w:t xml:space="preserve">        }</w:t>
+      </w:r>
+    </w:p>
+    <w:p>
+      <w:pPr>
+        <w:pStyle w:val="IT245"/>
+        <w:spacing w:before="0" w:line="276" w:lineRule="auto"/>
+        <w:rPr>
+          <w:color w:val="0070C0"/>
+          <w:lang/>
+        </w:rPr>
+      </w:pPr>
+      <w:r>
+        <w:rPr>
+          <w:color w:val="0070C0"/>
+          <w:lang/>
+        </w:rPr>
+        <w:t xml:space="preserve">    }</w:t>
+      </w:r>
+    </w:p>
+    <w:p>
+      <w:pPr>
+        <w:pStyle w:val="IT245"/>
+        <w:spacing w:before="0" w:line="276" w:lineRule="auto"/>
+        <w:rPr>
+          <w:color w:val="0070C0"/>
+          <w:lang/>
+        </w:rPr>
+      </w:pPr>
+    </w:p>
+    <w:p>
+      <w:pPr>
+        <w:pStyle w:val="IT245"/>
+        <w:spacing w:before="0" w:line="276" w:lineRule="auto"/>
+        <w:rPr>
+          <w:color w:val="0070C0"/>
+          <w:lang/>
+        </w:rPr>
+      </w:pPr>
+      <w:r>
+        <w:rPr>
+          <w:color w:val="0070C0"/>
+          <w:lang/>
+        </w:rPr>
+        <w:t xml:space="preserve">    public boolean isEmpty() {</w:t>
+      </w:r>
+    </w:p>
+    <w:p>
+      <w:pPr>
+        <w:pStyle w:val="IT245"/>
+        <w:spacing w:before="0" w:line="276" w:lineRule="auto"/>
+        <w:rPr>
+          <w:color w:val="0070C0"/>
+          <w:lang/>
+        </w:rPr>
+      </w:pPr>
+      <w:r>
+        <w:rPr>
+          <w:color w:val="0070C0"/>
+          <w:lang/>
+        </w:rPr>
+        <w:t xml:space="preserve">        return tasks.isEmpty();</w:t>
+      </w:r>
+    </w:p>
+    <w:p>
+      <w:pPr>
+        <w:pStyle w:val="IT245"/>
+        <w:spacing w:before="0" w:line="276" w:lineRule="auto"/>
+        <w:rPr>
+          <w:color w:val="0070C0"/>
+          <w:lang/>
+        </w:rPr>
+      </w:pPr>
+      <w:r>
+        <w:rPr>
+          <w:color w:val="0070C0"/>
+          <w:lang/>
+        </w:rPr>
+        <w:t xml:space="preserve">    }</w:t>
+      </w:r>
+    </w:p>
+    <w:p>
+      <w:pPr>
+        <w:pStyle w:val="IT245"/>
+        <w:spacing w:before="0" w:line="276" w:lineRule="auto"/>
+        <w:rPr>
+          <w:color w:val="0070C0"/>
+          <w:lang/>
+        </w:rPr>
+      </w:pPr>
+      <w:r>
+        <w:rPr>
+          <w:color w:val="0070C0"/>
+          <w:lang/>
+        </w:rPr>
+        <w:t>}</w:t>
+      </w:r>
+    </w:p>
+    <w:p>
+      <w:pPr>
+        <w:pStyle w:val="IT245"/>
+        <w:rPr>
+          <w:lang/>
+        </w:rPr>
+      </w:pPr>
+      <w:r>
+        <w:rPr>
+          <w:lang/>
+        </w:rPr>
+        <w:t>The addTask() method creates a task and scans the list until it finds the correct insertion position. The displayTasks() method prints tasks directly because the ArrayList is already maintained in processing order. The processNextTask() method removes the first task because index zero always contains the most urgent pending task.</w:t>
       </w:r>
     </w:p>
     <w:p>
@@ -8412,6 +9905,7 @@
           <w:color w:val="auto"/>
           <w:sz w:val="24"/>
           <w:szCs w:val="24"/>
+          <w:lang/>
         </w:rPr>
       </w:pPr>
       <w:bookmarkStart w:id="0" w:name="_GoBack"/>
@@ -8486,7 +9980,7 @@
               <wp:docPr id="768041508" name="Text Box 8" descr="Restricted - مقيد ">
                 <a:extLst xmlns:a="http://schemas.openxmlformats.org/drawingml/2006/main">
                   <a:ext uri="{5AE41FA2-C0FF-4470-9BD4-5FADCA87CBE2}">
-                    <aclsh:classification xmlns="" xmlns:cx1="http://schemas.microsoft.com/office/drawing/2015/9/8/chartex" xmlns:cx2="http://schemas.microsoft.com/office/drawing/2015/10/21/chartex" xmlns:cx3="http://schemas.microsoft.com/office/drawing/2016/5/9/chartex" xmlns:cx4="http://schemas.microsoft.com/office/drawing/2016/5/10/chartex" xmlns:cx5="http://schemas.microsoft.com/office/drawing/2016/5/11/chartex" xmlns:cx6="http://schemas.microsoft.com/office/drawing/2016/5/12/chartex" xmlns:cx7="http://schemas.microsoft.com/office/drawing/2016/5/13/chartex" xmlns:cx8="http://schemas.microsoft.com/office/drawing/2016/5/14/chartex" xmlns:aink="http://schemas.microsoft.com/office/drawing/2016/ink" xmlns:am3d="http://schemas.microsoft.com/office/drawing/2017/model3d" xmlns:oel="http://schemas.microsoft.com/office/2019/extlst" xmlns:o="urn:schemas-microsoft-com:office:office" xmlns:v="urn:schemas-microsoft-com:vml" xmlns:w10="urn:schemas-microsoft-com:office:word" xmlns:w="http://schemas.openxmlformats.org/wordprocessingml/2006/main" xmlns:w16cei="http://schemas.microsoft.com/office/word/2026/wordml/cei" xmlns:w16cex="http://schemas.microsoft.com/office/word/2018/wordml/cex" xmlns:w16cid="http://schemas.microsoft.com/office/word/2016/wordml/cid" xmlns:w16="http://schemas.microsoft.com/office/word/2018/wordml" xmlns:w16sdtdh="http://schemas.microsoft.com/office/word/2020/wordml/sdtdatahash" xmlns:w16sdtfl="http://schemas.microsoft.com/office/word/2024/wordml/sdtformatlock" xmlns:w16du="http://schemas.microsoft.com/office/word/2023/wordml/word16du" xmlns:aclsh="http://schemas.microsoft.com/office/drawing/2020/classificationShape" classificationOutcomeType="ftr"/>
+                    <aclsh:classification xmlns:aclsh="http://schemas.microsoft.com/office/drawing/2020/classificationShape" xmlns:w16du="http://schemas.microsoft.com/office/word/2023/wordml/word16du" xmlns:w16sdtfl="http://schemas.microsoft.com/office/word/2024/wordml/sdtformatlock" xmlns:w16sdtdh="http://schemas.microsoft.com/office/word/2020/wordml/sdtdatahash" xmlns:w16="http://schemas.microsoft.com/office/word/2018/wordml" xmlns:w16cid="http://schemas.microsoft.com/office/word/2016/wordml/cid" xmlns:w16cex="http://schemas.microsoft.com/office/word/2018/wordml/cex" xmlns:w16cei="http://schemas.microsoft.com/office/word/2026/wordml/cei" xmlns:w="http://schemas.openxmlformats.org/wordprocessingml/2006/main" xmlns:w10="urn:schemas-microsoft-com:office:word" xmlns:v="urn:schemas-microsoft-com:vml" xmlns:o="urn:schemas-microsoft-com:office:office" xmlns:oel="http://schemas.microsoft.com/office/2019/extlst" xmlns:am3d="http://schemas.microsoft.com/office/drawing/2017/model3d" xmlns:aink="http://schemas.microsoft.com/office/drawing/2016/ink" xmlns:cx8="http://schemas.microsoft.com/office/drawing/2016/5/14/chartex" xmlns:cx7="http://schemas.microsoft.com/office/drawing/2016/5/13/chartex" xmlns:cx6="http://schemas.microsoft.com/office/drawing/2016/5/12/chartex" xmlns:cx5="http://schemas.microsoft.com/office/drawing/2016/5/11/chartex" xmlns:cx4="http://schemas.microsoft.com/office/drawing/2016/5/10/chartex" xmlns:cx3="http://schemas.microsoft.com/office/drawing/2016/5/9/chartex" xmlns:cx2="http://schemas.microsoft.com/office/drawing/2015/10/21/chartex" xmlns:cx1="http://schemas.microsoft.com/office/drawing/2015/9/8/chartex" xmlns="" classificationOutcomeType="ftr"/>
                   </a:ext>
                 </a:extLst>
               </wp:docPr>
@@ -8644,7 +10138,7 @@
               <wp:docPr id="1894436925" name="Text Box 9" descr="Restricted - مقيد ">
                 <a:extLst xmlns:a="http://schemas.openxmlformats.org/drawingml/2006/main">
                   <a:ext uri="{5AE41FA2-C0FF-4470-9BD4-5FADCA87CBE2}">
-                    <aclsh:classification xmlns="" xmlns:cx1="http://schemas.microsoft.com/office/drawing/2015/9/8/chartex" xmlns:cx2="http://schemas.microsoft.com/office/drawing/2015/10/21/chartex" xmlns:cx3="http://schemas.microsoft.com/office/drawing/2016/5/9/chartex" xmlns:cx4="http://schemas.microsoft.com/office/drawing/2016/5/10/chartex" xmlns:cx5="http://schemas.microsoft.com/office/drawing/2016/5/11/chartex" xmlns:cx6="http://schemas.microsoft.com/office/drawing/2016/5/12/chartex" xmlns:cx7="http://schemas.microsoft.com/office/drawing/2016/5/13/chartex" xmlns:cx8="http://schemas.microsoft.com/office/drawing/2016/5/14/chartex" xmlns:aink="http://schemas.microsoft.com/office/drawing/2016/ink" xmlns:am3d="http://schemas.microsoft.com/office/drawing/2017/model3d" xmlns:oel="http://schemas.microsoft.com/office/2019/extlst" xmlns:o="urn:schemas-microsoft-com:office:office" xmlns:v="urn:schemas-microsoft-com:vml" xmlns:w10="urn:schemas-microsoft-com:office:word" xmlns:w="http://schemas.openxmlformats.org/wordprocessingml/2006/main" xmlns:w16cei="http://schemas.microsoft.com/office/word/2026/wordml/cei" xmlns:w16cex="http://schemas.microsoft.com/office/word/2018/wordml/cex" xmlns:w16cid="http://schemas.microsoft.com/office/word/2016/wordml/cid" xmlns:w16="http://schemas.microsoft.com/office/word/2018/wordml" xmlns:w16sdtdh="http://schemas.microsoft.com/office/word/2020/wordml/sdtdatahash" xmlns:w16sdtfl="http://schemas.microsoft.com/office/word/2024/wordml/sdtformatlock" xmlns:w16du="http://schemas.microsoft.com/office/word/2023/wordml/word16du" xmlns:aclsh="http://schemas.microsoft.com/office/drawing/2020/classificationShape" classificationOutcomeType="ftr"/>
+                    <aclsh:classification xmlns:aclsh="http://schemas.microsoft.com/office/drawing/2020/classificationShape" xmlns:w16du="http://schemas.microsoft.com/office/word/2023/wordml/word16du" xmlns:w16sdtfl="http://schemas.microsoft.com/office/word/2024/wordml/sdtformatlock" xmlns:w16sdtdh="http://schemas.microsoft.com/office/word/2020/wordml/sdtdatahash" xmlns:w16="http://schemas.microsoft.com/office/word/2018/wordml" xmlns:w16cid="http://schemas.microsoft.com/office/word/2016/wordml/cid" xmlns:w16cex="http://schemas.microsoft.com/office/word/2018/wordml/cex" xmlns:w16cei="http://schemas.microsoft.com/office/word/2026/wordml/cei" xmlns:w="http://schemas.openxmlformats.org/wordprocessingml/2006/main" xmlns:w10="urn:schemas-microsoft-com:office:word" xmlns:v="urn:schemas-microsoft-com:vml" xmlns:o="urn:schemas-microsoft-com:office:office" xmlns:oel="http://schemas.microsoft.com/office/2019/extlst" xmlns:am3d="http://schemas.microsoft.com/office/drawing/2017/model3d" xmlns:aink="http://schemas.microsoft.com/office/drawing/2016/ink" xmlns:cx8="http://schemas.microsoft.com/office/drawing/2016/5/14/chartex" xmlns:cx7="http://schemas.microsoft.com/office/drawing/2016/5/13/chartex" xmlns:cx6="http://schemas.microsoft.com/office/drawing/2016/5/12/chartex" xmlns:cx5="http://schemas.microsoft.com/office/drawing/2016/5/11/chartex" xmlns:cx4="http://schemas.microsoft.com/office/drawing/2016/5/10/chartex" xmlns:cx3="http://schemas.microsoft.com/office/drawing/2016/5/9/chartex" xmlns:cx2="http://schemas.microsoft.com/office/drawing/2015/10/21/chartex" xmlns:cx1="http://schemas.microsoft.com/office/drawing/2015/9/8/chartex" xmlns="" classificationOutcomeType="ftr"/>
                   </a:ext>
                 </a:extLst>
               </wp:docPr>
@@ -8802,7 +10296,7 @@
               <wp:docPr id="2005617642" name="Text Box 7" descr="Restricted - مقيد ">
                 <a:extLst xmlns:a="http://schemas.openxmlformats.org/drawingml/2006/main">
                   <a:ext uri="{5AE41FA2-C0FF-4470-9BD4-5FADCA87CBE2}">
-                    <aclsh:classification xmlns="" xmlns:cx1="http://schemas.microsoft.com/office/drawing/2015/9/8/chartex" xmlns:cx2="http://schemas.microsoft.com/office/drawing/2015/10/21/chartex" xmlns:cx3="http://schemas.microsoft.com/office/drawing/2016/5/9/chartex" xmlns:cx4="http://schemas.microsoft.com/office/drawing/2016/5/10/chartex" xmlns:cx5="http://schemas.microsoft.com/office/drawing/2016/5/11/chartex" xmlns:cx6="http://schemas.microsoft.com/office/drawing/2016/5/12/chartex" xmlns:cx7="http://schemas.microsoft.com/office/drawing/2016/5/13/chartex" xmlns:cx8="http://schemas.microsoft.com/office/drawing/2016/5/14/chartex" xmlns:aink="http://schemas.microsoft.com/office/drawing/2016/ink" xmlns:am3d="http://schemas.microsoft.com/office/drawing/2017/model3d" xmlns:oel="http://schemas.microsoft.com/office/2019/extlst" xmlns:o="urn:schemas-microsoft-com:office:office" xmlns:v="urn:schemas-microsoft-com:vml" xmlns:w10="urn:schemas-microsoft-com:office:word" xmlns:w="http://schemas.openxmlformats.org/wordprocessingml/2006/main" xmlns:w16cei="http://schemas.microsoft.com/office/word/2026/wordml/cei" xmlns:w16cex="http://schemas.microsoft.com/office/word/2018/wordml/cex" xmlns:w16cid="http://schemas.microsoft.com/office/word/2016/wordml/cid" xmlns:w16="http://schemas.microsoft.com/office/word/2018/wordml" xmlns:w16sdtdh="http://schemas.microsoft.com/office/word/2020/wordml/sdtdatahash" xmlns:w16sdtfl="http://schemas.microsoft.com/office/word/2024/wordml/sdtformatlock" xmlns:w16du="http://schemas.microsoft.com/office/word/2023/wordml/word16du" xmlns:aclsh="http://schemas.microsoft.com/office/drawing/2020/classificationShape" classificationOutcomeType="ftr"/>
+                    <aclsh:classification xmlns:aclsh="http://schemas.microsoft.com/office/drawing/2020/classificationShape" xmlns:w16du="http://schemas.microsoft.com/office/word/2023/wordml/word16du" xmlns:w16sdtfl="http://schemas.microsoft.com/office/word/2024/wordml/sdtformatlock" xmlns:w16sdtdh="http://schemas.microsoft.com/office/word/2020/wordml/sdtdatahash" xmlns:w16="http://schemas.microsoft.com/office/word/2018/wordml" xmlns:w16cid="http://schemas.microsoft.com/office/word/2016/wordml/cid" xmlns:w16cex="http://schemas.microsoft.com/office/word/2018/wordml/cex" xmlns:w16cei="http://schemas.microsoft.com/office/word/2026/wordml/cei" xmlns:w="http://schemas.openxmlformats.org/wordprocessingml/2006/main" xmlns:w10="urn:schemas-microsoft-com:office:word" xmlns:v="urn:schemas-microsoft-com:vml" xmlns:o="urn:schemas-microsoft-com:office:office" xmlns:oel="http://schemas.microsoft.com/office/2019/extlst" xmlns:am3d="http://schemas.microsoft.com/office/drawing/2017/model3d" xmlns:aink="http://schemas.microsoft.com/office/drawing/2016/ink" xmlns:cx8="http://schemas.microsoft.com/office/drawing/2016/5/14/chartex" xmlns:cx7="http://schemas.microsoft.com/office/drawing/2016/5/13/chartex" xmlns:cx6="http://schemas.microsoft.com/office/drawing/2016/5/12/chartex" xmlns:cx5="http://schemas.microsoft.com/office/drawing/2016/5/11/chartex" xmlns:cx4="http://schemas.microsoft.com/office/drawing/2016/5/10/chartex" xmlns:cx3="http://schemas.microsoft.com/office/drawing/2016/5/9/chartex" xmlns:cx2="http://schemas.microsoft.com/office/drawing/2015/10/21/chartex" xmlns:cx1="http://schemas.microsoft.com/office/drawing/2015/9/8/chartex" xmlns="" classificationOutcomeType="ftr"/>
                   </a:ext>
                 </a:extLst>
               </wp:docPr>
@@ -9232,7 +10726,7 @@
             </wp:anchor>
           </w:drawing>
         </mc:Choice>
-        <mc:Fallback xmlns:cx1="http://schemas.microsoft.com/office/drawing/2015/9/8/chartex" xmlns:cx2="http://schemas.microsoft.com/office/drawing/2015/10/21/chartex" xmlns:cx3="http://schemas.microsoft.com/office/drawing/2016/5/9/chartex" xmlns:cx4="http://schemas.microsoft.com/office/drawing/2016/5/10/chartex" xmlns:cx5="http://schemas.microsoft.com/office/drawing/2016/5/11/chartex" xmlns:cx6="http://schemas.microsoft.com/office/drawing/2016/5/12/chartex" xmlns:cx7="http://schemas.microsoft.com/office/drawing/2016/5/13/chartex" xmlns:cx8="http://schemas.microsoft.com/office/drawing/2016/5/14/chartex" xmlns:aink="http://schemas.microsoft.com/office/drawing/2016/ink" xmlns:am3d="http://schemas.microsoft.com/office/drawing/2017/model3d" xmlns:oel="http://schemas.microsoft.com/office/2019/extlst" xmlns:w16cei="http://schemas.microsoft.com/office/word/2026/wordml/cei" xmlns:w16cex="http://schemas.microsoft.com/office/word/2018/wordml/cex" xmlns:w16cid="http://schemas.microsoft.com/office/word/2016/wordml/cid" xmlns:w16="http://schemas.microsoft.com/office/word/2018/wordml" xmlns:w16sdtdh="http://schemas.microsoft.com/office/word/2020/wordml/sdtdatahash" xmlns:w16sdtfl="http://schemas.microsoft.com/office/word/2024/wordml/sdtformatlock" xmlns:w16du="http://schemas.microsoft.com/office/word/2023/wordml/word16du">
+        <mc:Fallback xmlns:w16du="http://schemas.microsoft.com/office/word/2023/wordml/word16du" xmlns:w16sdtfl="http://schemas.microsoft.com/office/word/2024/wordml/sdtformatlock" xmlns:w16sdtdh="http://schemas.microsoft.com/office/word/2020/wordml/sdtdatahash" xmlns:w16="http://schemas.microsoft.com/office/word/2018/wordml" xmlns:w16cid="http://schemas.microsoft.com/office/word/2016/wordml/cid" xmlns:w16cex="http://schemas.microsoft.com/office/word/2018/wordml/cex" xmlns:w16cei="http://schemas.microsoft.com/office/word/2026/wordml/cei" xmlns:oel="http://schemas.microsoft.com/office/2019/extlst" xmlns:am3d="http://schemas.microsoft.com/office/drawing/2017/model3d" xmlns:aink="http://schemas.microsoft.com/office/drawing/2016/ink" xmlns:cx8="http://schemas.microsoft.com/office/drawing/2016/5/14/chartex" xmlns:cx7="http://schemas.microsoft.com/office/drawing/2016/5/13/chartex" xmlns:cx6="http://schemas.microsoft.com/office/drawing/2016/5/12/chartex" xmlns:cx5="http://schemas.microsoft.com/office/drawing/2016/5/11/chartex" xmlns:cx4="http://schemas.microsoft.com/office/drawing/2016/5/10/chartex" xmlns:cx3="http://schemas.microsoft.com/office/drawing/2016/5/9/chartex" xmlns:cx2="http://schemas.microsoft.com/office/drawing/2015/10/21/chartex" xmlns:cx1="http://schemas.microsoft.com/office/drawing/2015/9/8/chartex">
           <w:pict>
             <v:line w14:anchorId="7169C831" id="Straight Connector 6" o:spid="_x0000_s1026" style="position:absolute;z-index:251660288;visibility:visible;mso-wrap-style:square;mso-width-percent:0;mso-height-percent:0;mso-wrap-distance-left:9pt;mso-wrap-distance-top:-3e-5mm;mso-wrap-distance-right:9pt;mso-wrap-distance-bottom:-3e-5mm;mso-position-horizontal:absolute;mso-position-horizontal-relative:text;mso-position-vertical:absolute;mso-position-vertical-relative:text;mso-width-percent:0;mso-height-percent:0;mso-width-relative:page;mso-height-relative:page" from="-68.95pt,-666.45pt" to="489.05pt,-666.45pt" o:gfxdata="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" strokecolor="#4f81bd" strokeweight="2pt">
               <v:shadow on="t" opacity="24903f" origin=",.5" offset="0,.55556mm"/>
@@ -9292,7 +10786,7 @@
             <w:fldChar w:fldCharType="separate"/>
           </w:r>
           <w:r>
-            <w:t>12</w:t>
+            <w:t>16</w:t>
           </w:r>
           <w:r>
             <w:fldChar w:fldCharType="end"/>
@@ -13771,6 +15265,7 @@
     <w:rsid w:val="003321AE"/>
     <w:rsid w:val="003323A9"/>
     <w:rsid w:val="00351A43"/>
+    <w:rsid w:val="00386CD0"/>
     <w:rsid w:val="003B158D"/>
     <w:rsid w:val="003E00F2"/>
     <w:rsid w:val="003E1B38"/>
@@ -14670,7 +16165,7 @@
 </file>
 
 <file path=customXml/itemProps3.xml><?xml version="1.0" encoding="utf-8"?>
-<ds:datastoreItem xmlns:ds="http://schemas.openxmlformats.org/officeDocument/2006/customXml" ds:itemID="{BFD1479A-9A85-43BA-B986-7E46923FDAFF}">
+<ds:datastoreItem xmlns:ds="http://schemas.openxmlformats.org/officeDocument/2006/customXml" ds:itemID="{8C936900-858E-464A-ABCE-F8D22A34EAC8}">
   <ds:schemaRefs>
     <ds:schemaRef ds:uri="http://schemas.openxmlformats.org/officeDocument/2006/bibliography"/>
   </ds:schemaRefs>

</xml_diff>